<commit_message>
new titles added in PMP
</commit_message>
<xml_diff>
--- a/Docmentations/PMP.docx
+++ b/Docmentations/PMP.docx
@@ -375,9 +375,10 @@
     </w:p>
     <w:p>
       <w:pPr>
+        <w:pStyle w:val="ListParagraph"/>
         <w:numPr>
           <w:ilvl w:val="0"/>
-          <w:numId w:val="9"/>
+          <w:numId w:val="16"/>
         </w:numPr>
         <w:rPr>
           <w:rFonts w:asciiTheme="majorBidi" w:hAnsiTheme="majorBidi" w:cstheme="majorBidi"/>
@@ -390,8 +391,8 @@
           <w:rFonts w:asciiTheme="majorBidi" w:hAnsiTheme="majorBidi" w:cstheme="majorBidi"/>
           <w:b/>
           <w:bCs/>
-          <w:sz w:val="28"/>
-          <w:szCs w:val="28"/>
+          <w:sz w:val="32"/>
+          <w:szCs w:val="32"/>
         </w:rPr>
         <w:t>Project Scope Management</w:t>
       </w:r>
@@ -402,17 +403,14 @@
           <w:szCs w:val="28"/>
         </w:rPr>
         <w:br/>
-        <w:t xml:space="preserve">1.1 </w:t>
-      </w:r>
-      <w:r>
-        <w:rPr>
-          <w:rFonts w:asciiTheme="majorBidi" w:hAnsiTheme="majorBidi" w:cstheme="majorBidi"/>
-          <w:b/>
-          <w:bCs/>
-          <w:sz w:val="28"/>
-          <w:szCs w:val="28"/>
-        </w:rPr>
-        <w:t>Project Objectives</w:t>
+      </w:r>
+      <w:r>
+        <w:rPr>
+          <w:rFonts w:asciiTheme="majorBidi" w:hAnsiTheme="majorBidi" w:cstheme="majorBidi"/>
+          <w:sz w:val="28"/>
+          <w:szCs w:val="28"/>
+        </w:rPr>
+        <w:t>1.1 Project Objectives</w:t>
       </w:r>
       <w:r>
         <w:rPr>
@@ -421,17 +419,7 @@
           <w:szCs w:val="28"/>
         </w:rPr>
         <w:br/>
-        <w:t xml:space="preserve">1.2 </w:t>
-      </w:r>
-      <w:r>
-        <w:rPr>
-          <w:rFonts w:asciiTheme="majorBidi" w:hAnsiTheme="majorBidi" w:cstheme="majorBidi"/>
-          <w:b/>
-          <w:bCs/>
-          <w:sz w:val="28"/>
-          <w:szCs w:val="28"/>
-        </w:rPr>
-        <w:t>Scope Statement</w:t>
+        <w:t>1.2 Scope Statement</w:t>
       </w:r>
       <w:r>
         <w:rPr>
@@ -440,17 +428,7 @@
           <w:szCs w:val="28"/>
         </w:rPr>
         <w:br/>
-        <w:t xml:space="preserve">1.2.1 </w:t>
-      </w:r>
-      <w:r>
-        <w:rPr>
-          <w:rFonts w:asciiTheme="majorBidi" w:hAnsiTheme="majorBidi" w:cstheme="majorBidi"/>
-          <w:b/>
-          <w:bCs/>
-          <w:sz w:val="28"/>
-          <w:szCs w:val="28"/>
-        </w:rPr>
-        <w:t>In Scope</w:t>
+        <w:t>1.2.1 In Scope</w:t>
       </w:r>
       <w:r>
         <w:rPr>
@@ -459,17 +437,7 @@
           <w:szCs w:val="28"/>
         </w:rPr>
         <w:br/>
-        <w:t xml:space="preserve">1.2.2 </w:t>
-      </w:r>
-      <w:r>
-        <w:rPr>
-          <w:rFonts w:asciiTheme="majorBidi" w:hAnsiTheme="majorBidi" w:cstheme="majorBidi"/>
-          <w:b/>
-          <w:bCs/>
-          <w:sz w:val="28"/>
-          <w:szCs w:val="28"/>
-        </w:rPr>
-        <w:t>Out of Scope</w:t>
+        <w:t>1.2.2 Out of Scope</w:t>
       </w:r>
       <w:r>
         <w:rPr>
@@ -482,9 +450,10 @@
     </w:p>
     <w:p>
       <w:pPr>
+        <w:pStyle w:val="ListParagraph"/>
         <w:numPr>
           <w:ilvl w:val="0"/>
-          <w:numId w:val="9"/>
+          <w:numId w:val="16"/>
         </w:numPr>
         <w:rPr>
           <w:rFonts w:asciiTheme="majorBidi" w:hAnsiTheme="majorBidi" w:cstheme="majorBidi"/>
@@ -497,8 +466,8 @@
           <w:rFonts w:asciiTheme="majorBidi" w:hAnsiTheme="majorBidi" w:cstheme="majorBidi"/>
           <w:b/>
           <w:bCs/>
-          <w:sz w:val="28"/>
-          <w:szCs w:val="28"/>
+          <w:sz w:val="32"/>
+          <w:szCs w:val="32"/>
         </w:rPr>
         <w:t>Schedule Management</w:t>
       </w:r>
@@ -514,8 +483,6 @@
       <w:r>
         <w:rPr>
           <w:rFonts w:asciiTheme="majorBidi" w:hAnsiTheme="majorBidi" w:cstheme="majorBidi"/>
-          <w:b/>
-          <w:bCs/>
           <w:sz w:val="28"/>
           <w:szCs w:val="28"/>
         </w:rPr>
@@ -528,96 +495,158 @@
           <w:szCs w:val="28"/>
         </w:rPr>
         <w:br/>
-        <w:t xml:space="preserve">2.2 </w:t>
-      </w:r>
-      <w:r>
-        <w:rPr>
-          <w:rFonts w:asciiTheme="majorBidi" w:hAnsiTheme="majorBidi" w:cstheme="majorBidi"/>
-          <w:b/>
-          <w:bCs/>
-          <w:sz w:val="28"/>
-          <w:szCs w:val="28"/>
-        </w:rPr>
-        <w:t>Task Management Process</w:t>
-      </w:r>
+        <w:t>2.2 Task Management Process</w:t>
+      </w:r>
+    </w:p>
+    <w:p>
+      <w:pPr>
+        <w:pStyle w:val="ListParagraph"/>
+        <w:numPr>
+          <w:ilvl w:val="1"/>
+          <w:numId w:val="16"/>
+        </w:numPr>
+        <w:rPr>
+          <w:rFonts w:asciiTheme="majorBidi" w:hAnsiTheme="majorBidi" w:cstheme="majorBidi"/>
+          <w:sz w:val="28"/>
+          <w:szCs w:val="28"/>
+        </w:rPr>
+      </w:pPr>
+      <w:r>
+        <w:rPr>
+          <w:rFonts w:asciiTheme="majorBidi" w:hAnsiTheme="majorBidi" w:cstheme="majorBidi"/>
+          <w:sz w:val="28"/>
+          <w:szCs w:val="28"/>
+        </w:rPr>
+        <w:t>Change Request Process</w:t>
+      </w:r>
+    </w:p>
+    <w:p>
+      <w:pPr>
+        <w:pStyle w:val="ListParagraph"/>
+        <w:numPr>
+          <w:ilvl w:val="1"/>
+          <w:numId w:val="16"/>
+        </w:numPr>
+        <w:rPr>
+          <w:rFonts w:asciiTheme="majorBidi" w:hAnsiTheme="majorBidi" w:cstheme="majorBidi"/>
+          <w:sz w:val="28"/>
+          <w:szCs w:val="28"/>
+        </w:rPr>
+      </w:pPr>
+      <w:r>
+        <w:rPr>
+          <w:rFonts w:asciiTheme="majorBidi" w:hAnsiTheme="majorBidi" w:cstheme="majorBidi"/>
+          <w:sz w:val="28"/>
+          <w:szCs w:val="28"/>
+        </w:rPr>
+        <w:t>Review Process:</w:t>
+      </w:r>
+    </w:p>
+    <w:p>
+      <w:pPr>
+        <w:pStyle w:val="ListParagraph"/>
+        <w:numPr>
+          <w:ilvl w:val="1"/>
+          <w:numId w:val="16"/>
+        </w:numPr>
+        <w:rPr>
+          <w:rFonts w:asciiTheme="majorBidi" w:hAnsiTheme="majorBidi" w:cstheme="majorBidi"/>
+          <w:sz w:val="28"/>
+          <w:szCs w:val="28"/>
+        </w:rPr>
+      </w:pPr>
+      <w:r>
+        <w:rPr>
+          <w:rFonts w:asciiTheme="majorBidi" w:hAnsiTheme="majorBidi" w:cstheme="majorBidi"/>
+          <w:sz w:val="28"/>
+          <w:szCs w:val="28"/>
+        </w:rPr>
+        <w:t>Communication process :</w:t>
+      </w:r>
+    </w:p>
+    <w:p>
+      <w:pPr>
+        <w:pStyle w:val="ListParagraph"/>
+        <w:numPr>
+          <w:ilvl w:val="0"/>
+          <w:numId w:val="16"/>
+        </w:numPr>
+        <w:rPr>
+          <w:rFonts w:asciiTheme="majorBidi" w:hAnsiTheme="majorBidi" w:cstheme="majorBidi"/>
+          <w:b/>
+          <w:bCs/>
+          <w:sz w:val="32"/>
+          <w:szCs w:val="32"/>
+        </w:rPr>
+      </w:pPr>
+      <w:r>
+        <w:rPr>
+          <w:rFonts w:asciiTheme="majorBidi" w:hAnsiTheme="majorBidi" w:cstheme="majorBidi"/>
+          <w:b/>
+          <w:bCs/>
+          <w:sz w:val="32"/>
+          <w:szCs w:val="32"/>
+        </w:rPr>
+        <w:t xml:space="preserve">Team Responsibilities </w:t>
+      </w:r>
+    </w:p>
+    <w:p>
+      <w:pPr>
+        <w:pStyle w:val="ListParagraph"/>
+        <w:numPr>
+          <w:ilvl w:val="0"/>
+          <w:numId w:val="16"/>
+        </w:numPr>
+        <w:rPr>
+          <w:rFonts w:asciiTheme="majorBidi" w:hAnsiTheme="majorBidi" w:cstheme="majorBidi"/>
+          <w:b/>
+          <w:bCs/>
+          <w:sz w:val="32"/>
+          <w:szCs w:val="32"/>
+        </w:rPr>
+      </w:pPr>
+      <w:r>
+        <w:rPr>
+          <w:rFonts w:asciiTheme="majorBidi" w:hAnsiTheme="majorBidi" w:cstheme="majorBidi"/>
+          <w:b/>
+          <w:bCs/>
+          <w:sz w:val="32"/>
+          <w:szCs w:val="32"/>
+        </w:rPr>
+        <w:t>Risk Management Process:</w:t>
+      </w:r>
+    </w:p>
+    <w:p>
+      <w:pPr>
+        <w:rPr>
+          <w:rFonts w:asciiTheme="majorBidi" w:hAnsiTheme="majorBidi" w:cstheme="majorBidi"/>
+          <w:b/>
+          <w:bCs/>
+          <w:sz w:val="30"/>
+          <w:szCs w:val="30"/>
+        </w:rPr>
+      </w:pPr>
+    </w:p>
+    <w:p>
+      <w:pPr>
+        <w:rPr>
+          <w:rFonts w:asciiTheme="majorBidi" w:hAnsiTheme="majorBidi" w:cstheme="majorBidi"/>
+          <w:b/>
+          <w:bCs/>
+          <w:sz w:val="28"/>
+          <w:szCs w:val="28"/>
+        </w:rPr>
+      </w:pPr>
     </w:p>
     <w:p>
       <w:pPr>
         <w:ind w:left="720"/>
         <w:rPr>
           <w:rFonts w:asciiTheme="majorBidi" w:hAnsiTheme="majorBidi" w:cstheme="majorBidi"/>
-          <w:b/>
-          <w:bCs/>
-          <w:sz w:val="28"/>
-          <w:szCs w:val="28"/>
-        </w:rPr>
-      </w:pPr>
-      <w:r>
-        <w:rPr>
-          <w:rFonts w:asciiTheme="majorBidi" w:hAnsiTheme="majorBidi" w:cstheme="majorBidi"/>
-          <w:sz w:val="28"/>
-          <w:szCs w:val="28"/>
-        </w:rPr>
-        <w:t>2.3</w:t>
-      </w:r>
-      <w:r>
-        <w:rPr>
-          <w:rFonts w:asciiTheme="majorBidi" w:hAnsiTheme="majorBidi" w:cstheme="majorBidi"/>
-          <w:b/>
-          <w:bCs/>
-          <w:sz w:val="28"/>
-          <w:szCs w:val="28"/>
-        </w:rPr>
-        <w:t xml:space="preserve"> </w:t>
-      </w:r>
-      <w:r>
-        <w:rPr>
-          <w:rFonts w:asciiTheme="majorBidi" w:hAnsiTheme="majorBidi" w:cstheme="majorBidi"/>
-          <w:b/>
-          <w:bCs/>
-          <w:sz w:val="28"/>
-          <w:szCs w:val="28"/>
-        </w:rPr>
-        <w:t>Change Request Process</w:t>
-      </w:r>
-    </w:p>
-    <w:p>
-      <w:pPr>
-        <w:ind w:left="720"/>
-        <w:rPr>
-          <w:rFonts w:asciiTheme="majorBidi" w:hAnsiTheme="majorBidi" w:cstheme="majorBidi"/>
-          <w:sz w:val="28"/>
-          <w:szCs w:val="28"/>
-        </w:rPr>
-      </w:pPr>
-      <w:r>
-        <w:rPr>
-          <w:rFonts w:asciiTheme="majorBidi" w:hAnsiTheme="majorBidi" w:cstheme="majorBidi"/>
-          <w:sz w:val="28"/>
-          <w:szCs w:val="28"/>
-        </w:rPr>
-        <w:t>2.4</w:t>
-      </w:r>
-      <w:r>
-        <w:rPr>
-          <w:rFonts w:asciiTheme="majorBidi" w:hAnsiTheme="majorBidi" w:cstheme="majorBidi"/>
-          <w:b/>
-          <w:bCs/>
-          <w:sz w:val="28"/>
-          <w:szCs w:val="28"/>
-        </w:rPr>
-        <w:t xml:space="preserve"> </w:t>
-      </w:r>
-      <w:r>
-        <w:rPr>
-          <w:rFonts w:asciiTheme="majorBidi" w:hAnsiTheme="majorBidi" w:cstheme="majorBidi"/>
-          <w:b/>
-          <w:bCs/>
-          <w:sz w:val="28"/>
-          <w:szCs w:val="28"/>
-        </w:rPr>
-        <w:t>Review Process:</w:t>
-      </w:r>
+          <w:sz w:val="28"/>
+          <w:szCs w:val="28"/>
+        </w:rPr>
+      </w:pPr>
     </w:p>
     <w:p>
       <w:pPr>
@@ -636,62 +665,6 @@
         </w:rPr>
         <w:br/>
       </w:r>
-    </w:p>
-    <w:p>
-      <w:pPr>
-        <w:rPr>
-          <w:rFonts w:asciiTheme="majorBidi" w:hAnsiTheme="majorBidi" w:cstheme="majorBidi"/>
-        </w:rPr>
-      </w:pPr>
-    </w:p>
-    <w:p>
-      <w:pPr>
-        <w:rPr>
-          <w:rFonts w:asciiTheme="majorBidi" w:hAnsiTheme="majorBidi" w:cstheme="majorBidi"/>
-        </w:rPr>
-      </w:pPr>
-    </w:p>
-    <w:p>
-      <w:pPr>
-        <w:rPr>
-          <w:rFonts w:asciiTheme="majorBidi" w:hAnsiTheme="majorBidi" w:cstheme="majorBidi"/>
-        </w:rPr>
-      </w:pPr>
-    </w:p>
-    <w:p>
-      <w:pPr>
-        <w:rPr>
-          <w:rFonts w:asciiTheme="majorBidi" w:hAnsiTheme="majorBidi" w:cstheme="majorBidi"/>
-        </w:rPr>
-      </w:pPr>
-    </w:p>
-    <w:p>
-      <w:pPr>
-        <w:rPr>
-          <w:rFonts w:asciiTheme="majorBidi" w:hAnsiTheme="majorBidi" w:cstheme="majorBidi"/>
-        </w:rPr>
-      </w:pPr>
-    </w:p>
-    <w:p>
-      <w:pPr>
-        <w:rPr>
-          <w:rFonts w:asciiTheme="majorBidi" w:hAnsiTheme="majorBidi" w:cstheme="majorBidi"/>
-        </w:rPr>
-      </w:pPr>
-    </w:p>
-    <w:p>
-      <w:pPr>
-        <w:rPr>
-          <w:rFonts w:asciiTheme="majorBidi" w:hAnsiTheme="majorBidi" w:cstheme="majorBidi"/>
-        </w:rPr>
-      </w:pPr>
-    </w:p>
-    <w:p>
-      <w:pPr>
-        <w:rPr>
-          <w:rFonts w:asciiTheme="majorBidi" w:hAnsiTheme="majorBidi" w:cstheme="majorBidi"/>
-        </w:rPr>
-      </w:pPr>
     </w:p>
     <w:p>
       <w:pPr>
@@ -1464,6 +1437,7 @@
           </w:tcPr>
           <w:p>
             <w:pPr>
+              <w:jc w:val="center"/>
               <w:rPr>
                 <w:rFonts w:asciiTheme="majorBidi" w:hAnsiTheme="majorBidi" w:cstheme="majorBidi"/>
                 <w:b w:val="0"/>
@@ -1482,7 +1456,7 @@
                 <w:sz w:val="28"/>
                 <w:szCs w:val="28"/>
               </w:rPr>
-              <w:t xml:space="preserve">Milestone (1) </w:t>
+              <w:t>Milestone (1)</w:t>
             </w:r>
           </w:p>
         </w:tc>
@@ -1783,20 +1757,23 @@
     </w:p>
     <w:p>
       <w:pPr>
-        <w:rPr>
-          <w:rFonts w:asciiTheme="majorBidi" w:hAnsiTheme="majorBidi" w:cstheme="majorBidi"/>
-          <w:b/>
-          <w:bCs/>
-          <w:sz w:val="32"/>
-          <w:szCs w:val="32"/>
+        <w:pBdr>
+          <w:bottom w:val="single" w:sz="4" w:space="1" w:color="auto"/>
+        </w:pBdr>
+        <w:rPr>
+          <w:rFonts w:asciiTheme="majorBidi" w:hAnsiTheme="majorBidi" w:cstheme="majorBidi"/>
+          <w:b/>
+          <w:bCs/>
+          <w:sz w:val="40"/>
+          <w:szCs w:val="40"/>
         </w:rPr>
       </w:pPr>
       <w:r>
         <w:rPr>
           <w:rFonts w:asciiTheme="majorBidi" w:hAnsiTheme="majorBidi" w:cstheme="majorBidi"/>
           <w:color w:val="000000" w:themeColor="text1"/>
-          <w:sz w:val="36"/>
-          <w:szCs w:val="36"/>
+          <w:sz w:val="40"/>
+          <w:szCs w:val="40"/>
         </w:rPr>
         <w:lastRenderedPageBreak/>
         <w:t>2</w:t>
@@ -1805,19 +1782,19 @@
         <w:rPr>
           <w:rFonts w:asciiTheme="majorBidi" w:hAnsiTheme="majorBidi" w:cstheme="majorBidi"/>
           <w:color w:val="000000" w:themeColor="text1"/>
-          <w:sz w:val="36"/>
-          <w:szCs w:val="36"/>
+          <w:sz w:val="40"/>
+          <w:szCs w:val="40"/>
         </w:rPr>
         <w:t>.2</w:t>
       </w:r>
       <w:r>
         <w:rPr>
-          <w:rFonts w:asciiTheme="majorBidi" w:hAnsiTheme="majorBidi"/>
+          <w:rFonts w:asciiTheme="majorBidi" w:hAnsiTheme="majorBidi" w:cstheme="majorBidi"/>
           <w:i/>
           <w:iCs/>
           <w:color w:val="000000" w:themeColor="text1"/>
-          <w:sz w:val="36"/>
-          <w:szCs w:val="36"/>
+          <w:sz w:val="40"/>
+          <w:szCs w:val="40"/>
         </w:rPr>
         <w:t xml:space="preserve"> </w:t>
       </w:r>
@@ -1826,8 +1803,8 @@
           <w:rFonts w:asciiTheme="majorBidi" w:hAnsiTheme="majorBidi" w:cstheme="majorBidi"/>
           <w:b/>
           <w:bCs/>
-          <w:sz w:val="32"/>
-          <w:szCs w:val="32"/>
+          <w:sz w:val="40"/>
+          <w:szCs w:val="40"/>
         </w:rPr>
         <w:t>Task Management Process:</w:t>
       </w:r>
@@ -1935,16 +1912,6 @@
     </w:p>
     <w:p>
       <w:pPr>
-        <w:ind w:left="720"/>
-        <w:rPr>
-          <w:rFonts w:asciiTheme="majorBidi" w:hAnsiTheme="majorBidi" w:cstheme="majorBidi"/>
-          <w:sz w:val="28"/>
-          <w:szCs w:val="28"/>
-        </w:rPr>
-      </w:pPr>
-    </w:p>
-    <w:p>
-      <w:pPr>
         <w:rPr>
           <w:rFonts w:asciiTheme="majorBidi" w:hAnsiTheme="majorBidi" w:cstheme="majorBidi"/>
         </w:rPr>
@@ -1953,6 +1920,9 @@
     <w:p>
       <w:pPr>
         <w:pStyle w:val="Heading4"/>
+        <w:pBdr>
+          <w:bottom w:val="single" w:sz="4" w:space="1" w:color="auto"/>
+        </w:pBdr>
         <w:rPr>
           <w:rFonts w:asciiTheme="majorBidi" w:hAnsiTheme="majorBidi"/>
         </w:rPr>
@@ -1960,19 +1930,22 @@
     </w:p>
     <w:p>
       <w:pPr>
-        <w:rPr>
-          <w:rFonts w:asciiTheme="majorBidi" w:hAnsiTheme="majorBidi" w:cstheme="majorBidi"/>
-          <w:b/>
-          <w:bCs/>
-          <w:sz w:val="36"/>
-          <w:szCs w:val="36"/>
-        </w:rPr>
-      </w:pPr>
-      <w:r>
-        <w:rPr>
-          <w:rFonts w:asciiTheme="majorBidi" w:hAnsiTheme="majorBidi" w:cstheme="majorBidi"/>
-          <w:sz w:val="36"/>
-          <w:szCs w:val="36"/>
+        <w:pBdr>
+          <w:bottom w:val="single" w:sz="4" w:space="1" w:color="auto"/>
+        </w:pBdr>
+        <w:rPr>
+          <w:rFonts w:asciiTheme="majorBidi" w:hAnsiTheme="majorBidi" w:cstheme="majorBidi"/>
+          <w:b/>
+          <w:bCs/>
+          <w:sz w:val="40"/>
+          <w:szCs w:val="40"/>
+        </w:rPr>
+      </w:pPr>
+      <w:r>
+        <w:rPr>
+          <w:rFonts w:asciiTheme="majorBidi" w:hAnsiTheme="majorBidi" w:cstheme="majorBidi"/>
+          <w:sz w:val="40"/>
+          <w:szCs w:val="40"/>
         </w:rPr>
         <w:t>2.3</w:t>
       </w:r>
@@ -1981,8 +1954,8 @@
           <w:rFonts w:asciiTheme="majorBidi" w:hAnsiTheme="majorBidi" w:cstheme="majorBidi"/>
           <w:b/>
           <w:bCs/>
-          <w:sz w:val="36"/>
-          <w:szCs w:val="36"/>
+          <w:sz w:val="40"/>
+          <w:szCs w:val="40"/>
         </w:rPr>
         <w:t xml:space="preserve"> </w:t>
       </w:r>
@@ -1992,8 +1965,8 @@
           <w:rFonts w:asciiTheme="majorBidi" w:hAnsiTheme="majorBidi" w:cstheme="majorBidi"/>
           <w:b/>
           <w:bCs/>
-          <w:sz w:val="36"/>
-          <w:szCs w:val="36"/>
+          <w:sz w:val="40"/>
+          <w:szCs w:val="40"/>
         </w:rPr>
         <w:t>Change Request Process</w:t>
       </w:r>
@@ -2003,11 +1976,22 @@
           <w:rFonts w:asciiTheme="majorBidi" w:hAnsiTheme="majorBidi" w:cstheme="majorBidi"/>
           <w:b/>
           <w:bCs/>
-          <w:sz w:val="36"/>
-          <w:szCs w:val="36"/>
+          <w:sz w:val="40"/>
+          <w:szCs w:val="40"/>
         </w:rPr>
         <w:t>:</w:t>
       </w:r>
+    </w:p>
+    <w:p>
+      <w:pPr>
+        <w:rPr>
+          <w:rFonts w:asciiTheme="majorBidi" w:hAnsiTheme="majorBidi" w:cstheme="majorBidi"/>
+          <w:b/>
+          <w:bCs/>
+          <w:sz w:val="40"/>
+          <w:szCs w:val="40"/>
+        </w:rPr>
+      </w:pPr>
     </w:p>
     <w:p>
       <w:pPr>
@@ -2027,63 +2011,7 @@
           <w:sz w:val="28"/>
           <w:szCs w:val="28"/>
         </w:rPr>
-        <w:t>If a</w:t>
-      </w:r>
-      <w:r>
-        <w:rPr>
-          <w:rFonts w:asciiTheme="majorBidi" w:hAnsiTheme="majorBidi" w:cstheme="majorBidi"/>
-          <w:sz w:val="28"/>
-          <w:szCs w:val="28"/>
-        </w:rPr>
-        <w:t xml:space="preserve"> change is requested</w:t>
-      </w:r>
-      <w:r>
-        <w:rPr>
-          <w:rFonts w:asciiTheme="majorBidi" w:hAnsiTheme="majorBidi" w:cstheme="majorBidi"/>
-          <w:sz w:val="28"/>
-          <w:szCs w:val="28"/>
-        </w:rPr>
-        <w:t xml:space="preserve"> by</w:t>
-      </w:r>
-      <w:r>
-        <w:rPr>
-          <w:rFonts w:asciiTheme="majorBidi" w:hAnsiTheme="majorBidi" w:cstheme="majorBidi"/>
-          <w:sz w:val="28"/>
-          <w:szCs w:val="28"/>
-        </w:rPr>
-        <w:t xml:space="preserve"> </w:t>
-      </w:r>
-      <w:r>
-        <w:rPr>
-          <w:rFonts w:asciiTheme="majorBidi" w:hAnsiTheme="majorBidi" w:cstheme="majorBidi"/>
-          <w:sz w:val="28"/>
-          <w:szCs w:val="28"/>
-        </w:rPr>
-        <w:t>stak</w:t>
-      </w:r>
-      <w:r>
-        <w:rPr>
-          <w:rFonts w:asciiTheme="majorBidi" w:hAnsiTheme="majorBidi" w:cstheme="majorBidi"/>
-          <w:sz w:val="28"/>
-          <w:szCs w:val="28"/>
-        </w:rPr>
-        <w:t>e</w:t>
-      </w:r>
-      <w:r>
-        <w:rPr>
-          <w:rFonts w:asciiTheme="majorBidi" w:hAnsiTheme="majorBidi" w:cstheme="majorBidi"/>
-          <w:sz w:val="28"/>
-          <w:szCs w:val="28"/>
-        </w:rPr>
-        <w:t>holder</w:t>
-      </w:r>
-      <w:r>
-        <w:rPr>
-          <w:rFonts w:asciiTheme="majorBidi" w:hAnsiTheme="majorBidi" w:cstheme="majorBidi"/>
-          <w:sz w:val="28"/>
-          <w:szCs w:val="28"/>
-        </w:rPr>
-        <w:t xml:space="preserve"> and sent to the </w:t>
+        <w:t xml:space="preserve">If a change is requested by stakeholder and sent to the </w:t>
       </w:r>
       <w:r>
         <w:rPr>
@@ -2161,23 +2089,7 @@
           <w:sz w:val="28"/>
           <w:szCs w:val="28"/>
         </w:rPr>
-        <w:t xml:space="preserve">If the change is approved, it is recorded in the </w:t>
-      </w:r>
-      <w:r>
-        <w:rPr>
-          <w:rFonts w:asciiTheme="majorBidi" w:hAnsiTheme="majorBidi" w:cstheme="majorBidi"/>
-          <w:sz w:val="28"/>
-          <w:szCs w:val="28"/>
-        </w:rPr>
-        <w:t>Change Log</w:t>
-      </w:r>
-      <w:r>
-        <w:rPr>
-          <w:rFonts w:asciiTheme="majorBidi" w:hAnsiTheme="majorBidi" w:cstheme="majorBidi"/>
-          <w:sz w:val="28"/>
-          <w:szCs w:val="28"/>
-        </w:rPr>
-        <w:t xml:space="preserve"> in excel and the team is informed.</w:t>
+        <w:t>If the change is approved, it is recorded in the Change Log in excel and the team is informed.</w:t>
       </w:r>
     </w:p>
     <w:p>
@@ -2198,24 +2110,73 @@
           <w:sz w:val="28"/>
           <w:szCs w:val="28"/>
         </w:rPr>
-        <w:t xml:space="preserve">The project plan is updated and uploaded to </w:t>
-      </w:r>
-      <w:r>
-        <w:rPr>
-          <w:rFonts w:asciiTheme="majorBidi" w:hAnsiTheme="majorBidi" w:cstheme="majorBidi"/>
-          <w:sz w:val="28"/>
-          <w:szCs w:val="28"/>
-        </w:rPr>
-        <w:t>GitHub</w:t>
-      </w:r>
-      <w:r>
-        <w:rPr>
-          <w:rFonts w:asciiTheme="majorBidi" w:hAnsiTheme="majorBidi" w:cstheme="majorBidi"/>
-          <w:sz w:val="28"/>
-          <w:szCs w:val="28"/>
-        </w:rPr>
-        <w:t>.</w:t>
-      </w:r>
+        <w:t>The project plan is updated and uploaded to GitHub.</w:t>
+      </w:r>
+    </w:p>
+    <w:p>
+      <w:pPr>
+        <w:rPr>
+          <w:rFonts w:asciiTheme="majorBidi" w:hAnsiTheme="majorBidi" w:cstheme="majorBidi"/>
+          <w:sz w:val="28"/>
+          <w:szCs w:val="28"/>
+        </w:rPr>
+      </w:pPr>
+    </w:p>
+    <w:p>
+      <w:pPr>
+        <w:pBdr>
+          <w:bottom w:val="single" w:sz="4" w:space="1" w:color="auto"/>
+        </w:pBdr>
+        <w:rPr>
+          <w:rFonts w:asciiTheme="majorBidi" w:hAnsiTheme="majorBidi" w:cstheme="majorBidi"/>
+          <w:sz w:val="28"/>
+          <w:szCs w:val="28"/>
+        </w:rPr>
+      </w:pPr>
+    </w:p>
+    <w:p>
+      <w:pPr>
+        <w:pBdr>
+          <w:bottom w:val="single" w:sz="4" w:space="1" w:color="auto"/>
+        </w:pBdr>
+        <w:rPr>
+          <w:rFonts w:asciiTheme="majorBidi" w:hAnsiTheme="majorBidi" w:cstheme="majorBidi"/>
+          <w:b/>
+          <w:bCs/>
+          <w:sz w:val="40"/>
+          <w:szCs w:val="40"/>
+        </w:rPr>
+      </w:pPr>
+      <w:r>
+        <w:rPr>
+          <w:rFonts w:asciiTheme="majorBidi" w:hAnsiTheme="majorBidi" w:cstheme="majorBidi"/>
+          <w:sz w:val="40"/>
+          <w:szCs w:val="40"/>
+        </w:rPr>
+        <w:t>2.4</w:t>
+      </w:r>
+      <w:r>
+        <w:rPr>
+          <w:rFonts w:asciiTheme="majorBidi" w:hAnsiTheme="majorBidi" w:cstheme="majorBidi"/>
+          <w:b/>
+          <w:bCs/>
+          <w:sz w:val="40"/>
+          <w:szCs w:val="40"/>
+        </w:rPr>
+        <w:t xml:space="preserve"> </w:t>
+      </w:r>
+      <w:bookmarkStart w:id="2" w:name="_Hlk225696970"/>
+      <w:r>
+        <w:rPr>
+          <w:rFonts w:asciiTheme="majorBidi" w:hAnsiTheme="majorBidi" w:cstheme="majorBidi"/>
+          <w:b/>
+          <w:bCs/>
+          <w:sz w:val="40"/>
+          <w:szCs w:val="40"/>
+        </w:rPr>
+        <w:t>Review Process:</w:t>
+      </w:r>
+      <w:bookmarkEnd w:id="2"/>
     </w:p>
     <w:p>
       <w:pPr>
@@ -2226,66 +2187,6 @@
           <w:szCs w:val="28"/>
         </w:rPr>
       </w:pPr>
-    </w:p>
-    <w:p>
-      <w:pPr>
-        <w:ind w:left="720"/>
-        <w:rPr>
-          <w:rFonts w:asciiTheme="majorBidi" w:hAnsiTheme="majorBidi" w:cstheme="majorBidi"/>
-          <w:sz w:val="28"/>
-          <w:szCs w:val="28"/>
-        </w:rPr>
-      </w:pPr>
-    </w:p>
-    <w:p>
-      <w:pPr>
-        <w:rPr>
-          <w:rFonts w:asciiTheme="majorBidi" w:hAnsiTheme="majorBidi" w:cstheme="majorBidi"/>
-          <w:sz w:val="28"/>
-          <w:szCs w:val="28"/>
-        </w:rPr>
-      </w:pPr>
-    </w:p>
-    <w:p>
-      <w:pPr>
-        <w:rPr>
-          <w:rFonts w:asciiTheme="majorBidi" w:hAnsiTheme="majorBidi" w:cstheme="majorBidi"/>
-          <w:b/>
-          <w:bCs/>
-          <w:sz w:val="36"/>
-          <w:szCs w:val="36"/>
-        </w:rPr>
-      </w:pPr>
-      <w:r>
-        <w:rPr>
-          <w:rFonts w:asciiTheme="majorBidi" w:hAnsiTheme="majorBidi" w:cstheme="majorBidi"/>
-          <w:sz w:val="36"/>
-          <w:szCs w:val="36"/>
-        </w:rPr>
-        <w:t>2.4</w:t>
-      </w:r>
-      <w:r>
-        <w:rPr>
-          <w:rFonts w:asciiTheme="majorBidi" w:hAnsiTheme="majorBidi" w:cstheme="majorBidi"/>
-          <w:b/>
-          <w:bCs/>
-          <w:sz w:val="36"/>
-          <w:szCs w:val="36"/>
-        </w:rPr>
-        <w:t xml:space="preserve"> </w:t>
-      </w:r>
-      <w:bookmarkStart w:id="2" w:name="_Hlk225696970"/>
-      <w:r>
-        <w:rPr>
-          <w:rFonts w:asciiTheme="majorBidi" w:hAnsiTheme="majorBidi" w:cstheme="majorBidi"/>
-          <w:b/>
-          <w:bCs/>
-          <w:sz w:val="36"/>
-          <w:szCs w:val="36"/>
-        </w:rPr>
-        <w:t>Review Process:</w:t>
-      </w:r>
-      <w:bookmarkEnd w:id="2"/>
     </w:p>
     <w:p>
       <w:pPr>
@@ -2305,39 +2206,7 @@
           <w:sz w:val="28"/>
           <w:szCs w:val="28"/>
         </w:rPr>
-        <w:t xml:space="preserve">when a team member </w:t>
-      </w:r>
-      <w:r>
-        <w:rPr>
-          <w:rFonts w:asciiTheme="majorBidi" w:hAnsiTheme="majorBidi" w:cstheme="majorBidi"/>
-          <w:sz w:val="28"/>
-          <w:szCs w:val="28"/>
-        </w:rPr>
-        <w:t>finishes</w:t>
-      </w:r>
-      <w:r>
-        <w:rPr>
-          <w:rFonts w:asciiTheme="majorBidi" w:hAnsiTheme="majorBidi" w:cstheme="majorBidi"/>
-          <w:sz w:val="28"/>
-          <w:szCs w:val="28"/>
-        </w:rPr>
-        <w:t xml:space="preserve"> his task ,  share it with </w:t>
-      </w:r>
-      <w:r>
-        <w:rPr>
-          <w:rFonts w:asciiTheme="majorBidi" w:hAnsiTheme="majorBidi" w:cstheme="majorBidi"/>
-          <w:sz w:val="28"/>
-          <w:szCs w:val="28"/>
-        </w:rPr>
-        <w:t>another team member</w:t>
-      </w:r>
-      <w:r>
-        <w:rPr>
-          <w:rFonts w:asciiTheme="majorBidi" w:hAnsiTheme="majorBidi" w:cstheme="majorBidi"/>
-          <w:sz w:val="28"/>
-          <w:szCs w:val="28"/>
-        </w:rPr>
-        <w:t xml:space="preserve"> to review.</w:t>
+        <w:t>when a team member finishes his task ,  share it with another team member to review.</w:t>
       </w:r>
     </w:p>
     <w:p>
@@ -2379,23 +2248,7 @@
           <w:sz w:val="28"/>
           <w:szCs w:val="28"/>
         </w:rPr>
-        <w:t xml:space="preserve">If there are issues, the reviewer sends </w:t>
-      </w:r>
-      <w:r>
-        <w:rPr>
-          <w:rFonts w:asciiTheme="majorBidi" w:hAnsiTheme="majorBidi" w:cstheme="majorBidi"/>
-          <w:sz w:val="28"/>
-          <w:szCs w:val="28"/>
-        </w:rPr>
-        <w:t xml:space="preserve">feedback </w:t>
-      </w:r>
-      <w:r>
-        <w:rPr>
-          <w:rFonts w:asciiTheme="majorBidi" w:hAnsiTheme="majorBidi" w:cstheme="majorBidi"/>
-          <w:sz w:val="28"/>
-          <w:szCs w:val="28"/>
-        </w:rPr>
-        <w:t>back to the team member to fix.</w:t>
+        <w:t>If there are issues, the reviewer sends feedback back to the team member to fix.</w:t>
       </w:r>
     </w:p>
     <w:p>
@@ -2416,34 +2269,507 @@
           <w:sz w:val="28"/>
           <w:szCs w:val="28"/>
         </w:rPr>
-        <w:t xml:space="preserve">Once the review is approved, the output is marked as </w:t>
-      </w:r>
-      <w:r>
-        <w:rPr>
-          <w:rFonts w:asciiTheme="majorBidi" w:hAnsiTheme="majorBidi" w:cstheme="majorBidi"/>
-          <w:sz w:val="28"/>
-          <w:szCs w:val="28"/>
-        </w:rPr>
-        <w:t>Done</w:t>
-      </w:r>
-      <w:r>
-        <w:rPr>
-          <w:rFonts w:asciiTheme="majorBidi" w:hAnsiTheme="majorBidi" w:cstheme="majorBidi"/>
-          <w:sz w:val="28"/>
-          <w:szCs w:val="28"/>
-        </w:rPr>
-        <w:t xml:space="preserve"> in Excel and uploaded to </w:t>
-      </w:r>
-      <w:r>
-        <w:rPr>
-          <w:rFonts w:asciiTheme="majorBidi" w:hAnsiTheme="majorBidi" w:cstheme="majorBidi"/>
-          <w:sz w:val="28"/>
-          <w:szCs w:val="28"/>
-        </w:rPr>
-        <w:t>GitHub.</w:t>
-      </w:r>
-    </w:p>
-    <w:p/>
+        <w:t>Once the review is approved, the output is marked as Done in Excel and uploaded to GitHub.</w:t>
+      </w:r>
+    </w:p>
+    <w:p>
+      <w:pPr>
+        <w:rPr>
+          <w:rFonts w:asciiTheme="majorBidi" w:hAnsiTheme="majorBidi" w:cstheme="majorBidi"/>
+        </w:rPr>
+      </w:pPr>
+    </w:p>
+    <w:p>
+      <w:pPr>
+        <w:rPr>
+          <w:rFonts w:asciiTheme="majorBidi" w:hAnsiTheme="majorBidi" w:cstheme="majorBidi"/>
+        </w:rPr>
+      </w:pPr>
+    </w:p>
+    <w:p>
+      <w:pPr>
+        <w:pBdr>
+          <w:bottom w:val="single" w:sz="4" w:space="1" w:color="auto"/>
+        </w:pBdr>
+        <w:rPr>
+          <w:rFonts w:asciiTheme="majorBidi" w:hAnsiTheme="majorBidi" w:cstheme="majorBidi"/>
+        </w:rPr>
+      </w:pPr>
+    </w:p>
+    <w:p>
+      <w:pPr>
+        <w:pBdr>
+          <w:bottom w:val="single" w:sz="4" w:space="1" w:color="auto"/>
+        </w:pBdr>
+        <w:rPr>
+          <w:rFonts w:asciiTheme="majorBidi" w:hAnsiTheme="majorBidi" w:cstheme="majorBidi"/>
+          <w:b/>
+          <w:bCs/>
+          <w:sz w:val="40"/>
+          <w:szCs w:val="40"/>
+        </w:rPr>
+      </w:pPr>
+      <w:r>
+        <w:rPr>
+          <w:rFonts w:asciiTheme="majorBidi" w:hAnsiTheme="majorBidi" w:cstheme="majorBidi"/>
+          <w:b/>
+          <w:bCs/>
+          <w:sz w:val="40"/>
+          <w:szCs w:val="40"/>
+        </w:rPr>
+        <w:t>2.5 Communication process :</w:t>
+      </w:r>
+    </w:p>
+    <w:p>
+      <w:pPr>
+        <w:rPr>
+          <w:rFonts w:asciiTheme="majorBidi" w:hAnsiTheme="majorBidi" w:cstheme="majorBidi"/>
+          <w:b/>
+          <w:bCs/>
+          <w:sz w:val="36"/>
+          <w:szCs w:val="36"/>
+        </w:rPr>
+      </w:pPr>
+    </w:p>
+    <w:p>
+      <w:pPr>
+        <w:pStyle w:val="ListParagraph"/>
+        <w:numPr>
+          <w:ilvl w:val="1"/>
+          <w:numId w:val="20"/>
+        </w:numPr>
+        <w:rPr>
+          <w:rFonts w:asciiTheme="majorBidi" w:hAnsiTheme="majorBidi" w:cstheme="majorBidi"/>
+          <w:sz w:val="28"/>
+          <w:szCs w:val="28"/>
+        </w:rPr>
+      </w:pPr>
+      <w:r>
+        <w:rPr>
+          <w:rFonts w:asciiTheme="majorBidi" w:hAnsiTheme="majorBidi" w:cstheme="majorBidi"/>
+          <w:sz w:val="28"/>
+          <w:szCs w:val="28"/>
+        </w:rPr>
+        <w:t>Daily meeting is held by the project manager (using Google meet) with the team members to observe the progress of tasks and discuss any obstacles.</w:t>
+      </w:r>
+    </w:p>
+    <w:p>
+      <w:pPr>
+        <w:ind w:left="720"/>
+        <w:rPr>
+          <w:rFonts w:asciiTheme="majorBidi" w:hAnsiTheme="majorBidi" w:cstheme="majorBidi"/>
+          <w:sz w:val="28"/>
+          <w:szCs w:val="28"/>
+        </w:rPr>
+      </w:pPr>
+    </w:p>
+    <w:p>
+      <w:pPr>
+        <w:pStyle w:val="ListParagraph"/>
+        <w:numPr>
+          <w:ilvl w:val="1"/>
+          <w:numId w:val="20"/>
+        </w:numPr>
+        <w:rPr>
+          <w:rFonts w:asciiTheme="majorBidi" w:hAnsiTheme="majorBidi" w:cstheme="majorBidi"/>
+          <w:sz w:val="28"/>
+          <w:szCs w:val="28"/>
+        </w:rPr>
+      </w:pPr>
+      <w:r>
+        <w:rPr>
+          <w:rFonts w:asciiTheme="majorBidi" w:hAnsiTheme="majorBidi" w:cstheme="majorBidi"/>
+          <w:sz w:val="28"/>
+          <w:szCs w:val="28"/>
+        </w:rPr>
+        <w:t xml:space="preserve">2-Meeting notes are documented on project group chat on </w:t>
+      </w:r>
+      <w:proofErr w:type="spellStart"/>
+      <w:r>
+        <w:rPr>
+          <w:rFonts w:asciiTheme="majorBidi" w:hAnsiTheme="majorBidi" w:cstheme="majorBidi"/>
+          <w:sz w:val="28"/>
+          <w:szCs w:val="28"/>
+        </w:rPr>
+        <w:t>whatsapp</w:t>
+      </w:r>
+      <w:proofErr w:type="spellEnd"/>
+      <w:r>
+        <w:rPr>
+          <w:rFonts w:asciiTheme="majorBidi" w:hAnsiTheme="majorBidi" w:cstheme="majorBidi"/>
+          <w:sz w:val="28"/>
+          <w:szCs w:val="28"/>
+        </w:rPr>
+        <w:t>.</w:t>
+      </w:r>
+    </w:p>
+    <w:p>
+      <w:pPr>
+        <w:pStyle w:val="ListParagraph"/>
+        <w:numPr>
+          <w:ilvl w:val="1"/>
+          <w:numId w:val="20"/>
+        </w:numPr>
+        <w:rPr>
+          <w:rFonts w:asciiTheme="majorBidi" w:hAnsiTheme="majorBidi" w:cstheme="majorBidi"/>
+          <w:sz w:val="28"/>
+          <w:szCs w:val="28"/>
+        </w:rPr>
+      </w:pPr>
+      <w:r>
+        <w:rPr>
+          <w:rFonts w:asciiTheme="majorBidi" w:hAnsiTheme="majorBidi" w:cstheme="majorBidi"/>
+          <w:sz w:val="28"/>
+          <w:szCs w:val="28"/>
+        </w:rPr>
+        <w:t xml:space="preserve">Weekly meeting is held every Saturday </w:t>
+      </w:r>
+    </w:p>
+    <w:p>
+      <w:pPr>
+        <w:rPr>
+          <w:rFonts w:asciiTheme="majorBidi" w:hAnsiTheme="majorBidi" w:cstheme="majorBidi"/>
+          <w:sz w:val="28"/>
+          <w:szCs w:val="28"/>
+        </w:rPr>
+      </w:pPr>
+    </w:p>
+    <w:p>
+      <w:pPr>
+        <w:rPr>
+          <w:rFonts w:asciiTheme="majorBidi" w:hAnsiTheme="majorBidi" w:cstheme="majorBidi"/>
+        </w:rPr>
+      </w:pPr>
+    </w:p>
+    <w:p>
+      <w:pPr>
+        <w:rPr>
+          <w:rFonts w:asciiTheme="majorBidi" w:hAnsiTheme="majorBidi" w:cstheme="majorBidi"/>
+        </w:rPr>
+      </w:pPr>
+    </w:p>
+    <w:p>
+      <w:pPr>
+        <w:pBdr>
+          <w:bottom w:val="single" w:sz="4" w:space="1" w:color="auto"/>
+        </w:pBdr>
+        <w:rPr>
+          <w:rFonts w:asciiTheme="majorBidi" w:hAnsiTheme="majorBidi" w:cstheme="majorBidi"/>
+        </w:rPr>
+      </w:pPr>
+    </w:p>
+    <w:p>
+      <w:pPr>
+        <w:pBdr>
+          <w:bottom w:val="single" w:sz="4" w:space="1" w:color="auto"/>
+        </w:pBdr>
+        <w:rPr>
+          <w:rFonts w:asciiTheme="majorBidi" w:hAnsiTheme="majorBidi" w:cstheme="majorBidi"/>
+          <w:b/>
+          <w:bCs/>
+          <w:sz w:val="40"/>
+          <w:szCs w:val="40"/>
+        </w:rPr>
+      </w:pPr>
+      <w:r>
+        <w:rPr>
+          <w:rFonts w:asciiTheme="majorBidi" w:hAnsiTheme="majorBidi" w:cstheme="majorBidi"/>
+          <w:b/>
+          <w:bCs/>
+          <w:sz w:val="40"/>
+          <w:szCs w:val="40"/>
+        </w:rPr>
+        <w:lastRenderedPageBreak/>
+        <w:t>3.Team Responsibilities :</w:t>
+      </w:r>
+    </w:p>
+    <w:p>
+      <w:pPr>
+        <w:rPr>
+          <w:rFonts w:asciiTheme="majorBidi" w:hAnsiTheme="majorBidi" w:cstheme="majorBidi"/>
+          <w:sz w:val="28"/>
+          <w:szCs w:val="28"/>
+        </w:rPr>
+      </w:pPr>
+      <w:r>
+        <w:rPr>
+          <w:rFonts w:asciiTheme="majorBidi" w:hAnsiTheme="majorBidi" w:cstheme="majorBidi"/>
+          <w:sz w:val="28"/>
+          <w:szCs w:val="28"/>
+        </w:rPr>
+        <w:t>Developers :</w:t>
+      </w:r>
+    </w:p>
+    <w:p>
+      <w:pPr>
+        <w:rPr>
+          <w:rFonts w:asciiTheme="majorBidi" w:hAnsiTheme="majorBidi" w:cstheme="majorBidi"/>
+          <w:sz w:val="28"/>
+          <w:szCs w:val="28"/>
+        </w:rPr>
+      </w:pPr>
+      <w:r>
+        <w:rPr>
+          <w:rFonts w:asciiTheme="majorBidi" w:hAnsiTheme="majorBidi" w:cstheme="majorBidi"/>
+          <w:sz w:val="28"/>
+          <w:szCs w:val="28"/>
+        </w:rPr>
+        <w:t>Testers:</w:t>
+      </w:r>
+    </w:p>
+    <w:p>
+      <w:pPr>
+        <w:rPr>
+          <w:rFonts w:asciiTheme="majorBidi" w:hAnsiTheme="majorBidi" w:cstheme="majorBidi"/>
+          <w:sz w:val="28"/>
+          <w:szCs w:val="28"/>
+        </w:rPr>
+      </w:pPr>
+      <w:r>
+        <w:rPr>
+          <w:rFonts w:asciiTheme="majorBidi" w:hAnsiTheme="majorBidi" w:cstheme="majorBidi"/>
+          <w:sz w:val="28"/>
+          <w:szCs w:val="28"/>
+        </w:rPr>
+        <w:t>QA:</w:t>
+      </w:r>
+    </w:p>
+    <w:p>
+      <w:pPr>
+        <w:pBdr>
+          <w:bottom w:val="single" w:sz="4" w:space="1" w:color="auto"/>
+        </w:pBdr>
+        <w:rPr>
+          <w:rFonts w:asciiTheme="majorBidi" w:hAnsiTheme="majorBidi" w:cstheme="majorBidi"/>
+        </w:rPr>
+      </w:pPr>
+    </w:p>
+    <w:p>
+      <w:pPr>
+        <w:pBdr>
+          <w:bottom w:val="single" w:sz="4" w:space="1" w:color="auto"/>
+        </w:pBdr>
+        <w:rPr>
+          <w:rFonts w:asciiTheme="majorBidi" w:hAnsiTheme="majorBidi" w:cstheme="majorBidi"/>
+          <w:b/>
+          <w:bCs/>
+          <w:sz w:val="36"/>
+          <w:szCs w:val="36"/>
+        </w:rPr>
+      </w:pPr>
+      <w:r>
+        <w:rPr>
+          <w:rFonts w:asciiTheme="majorBidi" w:hAnsiTheme="majorBidi" w:cstheme="majorBidi"/>
+          <w:b/>
+          <w:bCs/>
+          <w:sz w:val="36"/>
+          <w:szCs w:val="36"/>
+        </w:rPr>
+        <w:t>4.Risk Management Process:</w:t>
+      </w:r>
+    </w:p>
+    <w:p>
+      <w:pPr>
+        <w:rPr>
+          <w:rFonts w:asciiTheme="majorBidi" w:hAnsiTheme="majorBidi" w:cstheme="majorBidi"/>
+          <w:b/>
+          <w:bCs/>
+          <w:sz w:val="36"/>
+          <w:szCs w:val="36"/>
+        </w:rPr>
+      </w:pPr>
+    </w:p>
+    <w:p>
+      <w:pPr>
+        <w:pStyle w:val="ListParagraph"/>
+        <w:numPr>
+          <w:ilvl w:val="0"/>
+          <w:numId w:val="17"/>
+        </w:numPr>
+        <w:rPr>
+          <w:rFonts w:asciiTheme="majorBidi" w:hAnsiTheme="majorBidi" w:cstheme="majorBidi"/>
+          <w:sz w:val="28"/>
+          <w:szCs w:val="28"/>
+        </w:rPr>
+      </w:pPr>
+      <w:r>
+        <w:rPr>
+          <w:rFonts w:asciiTheme="majorBidi" w:hAnsiTheme="majorBidi" w:cstheme="majorBidi"/>
+          <w:sz w:val="28"/>
+          <w:szCs w:val="28"/>
+        </w:rPr>
+        <w:t>Any team member who spots a potential problem reports it to the Project Manager.</w:t>
+      </w:r>
+    </w:p>
+    <w:p>
+      <w:pPr>
+        <w:pStyle w:val="ListParagraph"/>
+        <w:numPr>
+          <w:ilvl w:val="0"/>
+          <w:numId w:val="17"/>
+        </w:numPr>
+        <w:rPr>
+          <w:rFonts w:asciiTheme="majorBidi" w:hAnsiTheme="majorBidi" w:cstheme="majorBidi"/>
+          <w:sz w:val="28"/>
+          <w:szCs w:val="28"/>
+        </w:rPr>
+      </w:pPr>
+      <w:r>
+        <w:rPr>
+          <w:rFonts w:asciiTheme="majorBidi" w:hAnsiTheme="majorBidi" w:cstheme="majorBidi"/>
+          <w:sz w:val="28"/>
+          <w:szCs w:val="28"/>
+        </w:rPr>
+        <w:t>The risk is added to the Risk sheet with a short description of it .</w:t>
+      </w:r>
+    </w:p>
+    <w:p>
+      <w:pPr>
+        <w:ind w:left="228"/>
+        <w:rPr>
+          <w:rFonts w:asciiTheme="majorBidi" w:hAnsiTheme="majorBidi" w:cstheme="majorBidi"/>
+          <w:sz w:val="28"/>
+          <w:szCs w:val="28"/>
+        </w:rPr>
+      </w:pPr>
+    </w:p>
+    <w:p>
+      <w:pPr>
+        <w:pStyle w:val="ListParagraph"/>
+        <w:numPr>
+          <w:ilvl w:val="0"/>
+          <w:numId w:val="17"/>
+        </w:numPr>
+        <w:rPr>
+          <w:rFonts w:asciiTheme="majorBidi" w:hAnsiTheme="majorBidi" w:cstheme="majorBidi"/>
+          <w:sz w:val="28"/>
+          <w:szCs w:val="28"/>
+        </w:rPr>
+      </w:pPr>
+      <w:r>
+        <w:rPr>
+          <w:rFonts w:asciiTheme="majorBidi" w:hAnsiTheme="majorBidi" w:cstheme="majorBidi"/>
+          <w:sz w:val="28"/>
+          <w:szCs w:val="28"/>
+        </w:rPr>
+        <w:t>The Project Manager ranks the risk based on how it could affect the project.</w:t>
+      </w:r>
+    </w:p>
+    <w:p>
+      <w:pPr>
+        <w:rPr>
+          <w:rFonts w:asciiTheme="majorBidi" w:hAnsiTheme="majorBidi" w:cstheme="majorBidi"/>
+          <w:sz w:val="28"/>
+          <w:szCs w:val="28"/>
+        </w:rPr>
+      </w:pPr>
+    </w:p>
+    <w:p>
+      <w:pPr>
+        <w:pStyle w:val="ListParagraph"/>
+        <w:numPr>
+          <w:ilvl w:val="0"/>
+          <w:numId w:val="17"/>
+        </w:numPr>
+        <w:rPr>
+          <w:rFonts w:asciiTheme="majorBidi" w:hAnsiTheme="majorBidi" w:cstheme="majorBidi"/>
+          <w:sz w:val="28"/>
+          <w:szCs w:val="28"/>
+        </w:rPr>
+      </w:pPr>
+      <w:r>
+        <w:rPr>
+          <w:rFonts w:asciiTheme="majorBidi" w:hAnsiTheme="majorBidi" w:cstheme="majorBidi"/>
+          <w:sz w:val="28"/>
+          <w:szCs w:val="28"/>
+        </w:rPr>
+        <w:t xml:space="preserve">The team agrees on a simple </w:t>
+      </w:r>
+      <w:r>
+        <w:rPr>
+          <w:rFonts w:asciiTheme="majorBidi" w:hAnsiTheme="majorBidi" w:cstheme="majorBidi"/>
+          <w:b/>
+          <w:bCs/>
+          <w:sz w:val="28"/>
+          <w:szCs w:val="28"/>
+        </w:rPr>
+        <w:t>action</w:t>
+      </w:r>
+      <w:r>
+        <w:rPr>
+          <w:rFonts w:asciiTheme="majorBidi" w:hAnsiTheme="majorBidi" w:cstheme="majorBidi"/>
+          <w:sz w:val="28"/>
+          <w:szCs w:val="28"/>
+        </w:rPr>
+        <w:t xml:space="preserve"> to reduce or avoid the risk .</w:t>
+      </w:r>
+    </w:p>
+    <w:p>
+      <w:pPr>
+        <w:pStyle w:val="ListParagraph"/>
+        <w:ind w:left="588"/>
+        <w:rPr>
+          <w:rFonts w:asciiTheme="majorBidi" w:hAnsiTheme="majorBidi" w:cstheme="majorBidi"/>
+          <w:sz w:val="28"/>
+          <w:szCs w:val="28"/>
+        </w:rPr>
+      </w:pPr>
+    </w:p>
+    <w:p>
+      <w:pPr>
+        <w:pStyle w:val="ListParagraph"/>
+        <w:numPr>
+          <w:ilvl w:val="0"/>
+          <w:numId w:val="17"/>
+        </w:numPr>
+        <w:rPr>
+          <w:rFonts w:asciiTheme="majorBidi" w:hAnsiTheme="majorBidi" w:cstheme="majorBidi"/>
+          <w:sz w:val="28"/>
+          <w:szCs w:val="28"/>
+        </w:rPr>
+      </w:pPr>
+      <w:r>
+        <w:rPr>
+          <w:rFonts w:asciiTheme="majorBidi" w:hAnsiTheme="majorBidi" w:cstheme="majorBidi"/>
+          <w:sz w:val="28"/>
+          <w:szCs w:val="28"/>
+        </w:rPr>
+        <w:t>The Risk Sheet is reviewed in every weekly meeting (Sat</w:t>
+      </w:r>
+      <w:r>
+        <w:rPr>
+          <w:rFonts w:asciiTheme="majorBidi" w:hAnsiTheme="majorBidi" w:cstheme="majorBidi"/>
+          <w:sz w:val="28"/>
+          <w:szCs w:val="28"/>
+        </w:rPr>
+        <w:t>urday</w:t>
+      </w:r>
+      <w:r>
+        <w:rPr>
+          <w:rFonts w:asciiTheme="majorBidi" w:hAnsiTheme="majorBidi" w:cstheme="majorBidi"/>
+          <w:sz w:val="28"/>
+          <w:szCs w:val="28"/>
+        </w:rPr>
+        <w:t>) to update the status of each risk</w:t>
+      </w:r>
+      <w:r>
+        <w:rPr>
+          <w:rFonts w:asciiTheme="majorBidi" w:hAnsiTheme="majorBidi" w:cstheme="majorBidi"/>
+          <w:sz w:val="28"/>
+          <w:szCs w:val="28"/>
+        </w:rPr>
+        <w:t>.</w:t>
+      </w:r>
+    </w:p>
+    <w:p>
+      <w:pPr>
+        <w:rPr>
+          <w:rFonts w:asciiTheme="majorBidi" w:hAnsiTheme="majorBidi" w:cstheme="majorBidi"/>
+          <w:sz w:val="28"/>
+          <w:szCs w:val="28"/>
+        </w:rPr>
+      </w:pPr>
+    </w:p>
     <w:sectPr>
       <w:pgSz w:w="12240" w:h="15840"/>
       <w:pgMar w:top="1440" w:right="1440" w:bottom="1440" w:left="1440" w:header="720" w:footer="720" w:gutter="0"/>
@@ -2463,6 +2789,119 @@
 <file path=word/numbering.xml><?xml version="1.0" encoding="utf-8"?>
 <w:numbering xmlns:wpc="http://schemas.microsoft.com/office/word/2010/wordprocessingCanvas" xmlns:cx="http://schemas.microsoft.com/office/drawing/2014/chartex" xmlns:cx1="http://schemas.microsoft.com/office/drawing/2015/9/8/chartex" xmlns:cx2="http://schemas.microsoft.com/office/drawing/2015/10/21/chartex" xmlns:cx3="http://schemas.microsoft.com/office/drawing/2016/5/9/chartex" xmlns:cx4="http://schemas.microsoft.com/office/drawing/2016/5/10/chartex" xmlns:cx5="http://schemas.microsoft.com/office/drawing/2016/5/11/chartex" xmlns:cx6="http://schemas.microsoft.com/office/drawing/2016/5/12/chartex" xmlns:cx7="http://schemas.microsoft.com/office/drawing/2016/5/13/chartex" xmlns:cx8="http://schemas.microsoft.com/office/drawing/2016/5/14/chartex" xmlns:mc="http://schemas.openxmlformats.org/markup-compatibility/2006" xmlns:aink="http://schemas.microsoft.com/office/drawing/2016/ink" xmlns:am3d="http://schemas.microsoft.com/office/drawing/2017/model3d" xmlns:o="urn:schemas-microsoft-com:office:office" xmlns:oel="http://schemas.microsoft.com/office/2019/extlst" xmlns:r="http://schemas.openxmlformats.org/officeDocument/2006/relationships" xmlns:m="http://schemas.openxmlformats.org/officeDocument/2006/math" xmlns:v="urn:schemas-microsoft-com:vml" xmlns:wp14="http://schemas.microsoft.com/office/word/2010/wordprocessingDrawing" xmlns:wp="http://schemas.openxmlformats.org/drawingml/2006/wordprocessingDrawing" xmlns:w10="urn:schemas-microsoft-com:office:word" xmlns:w="http://schemas.openxmlformats.org/wordprocessingml/2006/main" xmlns:w14="http://schemas.microsoft.com/office/word/2010/wordml" xmlns:w15="http://schemas.microsoft.com/office/word/2012/wordml" xmlns:w16cex="http://schemas.microsoft.com/office/word/2018/wordml/cex" xmlns:w16cid="http://schemas.microsoft.com/office/word/2016/wordml/cid" xmlns:w16="http://schemas.microsoft.com/office/word/2018/wordml" xmlns:w16du="http://schemas.microsoft.com/office/word/2023/wordml/word16du" xmlns:w16sdtdh="http://schemas.microsoft.com/office/word/2020/wordml/sdtdatahash" xmlns:w16se="http://schemas.microsoft.com/office/word/2015/wordml/symex" xmlns:wpg="http://schemas.microsoft.com/office/word/2010/wordprocessingGroup" xmlns:wpi="http://schemas.microsoft.com/office/word/2010/wordprocessingInk" xmlns:wne="http://schemas.microsoft.com/office/word/2006/wordml" xmlns:wps="http://schemas.microsoft.com/office/word/2010/wordprocessingShape" mc:Ignorable="w14 w15 w16se w16cid w16 w16cex w16sdtdh w16du wp14">
   <w:abstractNum w:abstractNumId="0" w15:restartNumberingAfterBreak="0">
+    <w:nsid w:val="00F43DD6"/>
+    <w:multiLevelType w:val="hybridMultilevel"/>
+    <w:tmpl w:val="E9168F20"/>
+    <w:lvl w:ilvl="0" w:tplc="04090001">
+      <w:start w:val="1"/>
+      <w:numFmt w:val="bullet"/>
+      <w:lvlText w:val=""/>
+      <w:lvlJc w:val="left"/>
+      <w:pPr>
+        <w:ind w:left="720" w:hanging="360"/>
+      </w:pPr>
+      <w:rPr>
+        <w:rFonts w:ascii="Symbol" w:hAnsi="Symbol" w:hint="default"/>
+      </w:rPr>
+    </w:lvl>
+    <w:lvl w:ilvl="1" w:tplc="04090003">
+      <w:start w:val="1"/>
+      <w:numFmt w:val="bullet"/>
+      <w:lvlText w:val="o"/>
+      <w:lvlJc w:val="left"/>
+      <w:pPr>
+        <w:ind w:left="1440" w:hanging="360"/>
+      </w:pPr>
+      <w:rPr>
+        <w:rFonts w:ascii="Courier New" w:hAnsi="Courier New" w:cs="Courier New" w:hint="default"/>
+      </w:rPr>
+    </w:lvl>
+    <w:lvl w:ilvl="2" w:tplc="04090005" w:tentative="1">
+      <w:start w:val="1"/>
+      <w:numFmt w:val="bullet"/>
+      <w:lvlText w:val=""/>
+      <w:lvlJc w:val="left"/>
+      <w:pPr>
+        <w:ind w:left="2160" w:hanging="360"/>
+      </w:pPr>
+      <w:rPr>
+        <w:rFonts w:ascii="Wingdings" w:hAnsi="Wingdings" w:hint="default"/>
+      </w:rPr>
+    </w:lvl>
+    <w:lvl w:ilvl="3" w:tplc="04090001" w:tentative="1">
+      <w:start w:val="1"/>
+      <w:numFmt w:val="bullet"/>
+      <w:lvlText w:val=""/>
+      <w:lvlJc w:val="left"/>
+      <w:pPr>
+        <w:ind w:left="2880" w:hanging="360"/>
+      </w:pPr>
+      <w:rPr>
+        <w:rFonts w:ascii="Symbol" w:hAnsi="Symbol" w:hint="default"/>
+      </w:rPr>
+    </w:lvl>
+    <w:lvl w:ilvl="4" w:tplc="04090003" w:tentative="1">
+      <w:start w:val="1"/>
+      <w:numFmt w:val="bullet"/>
+      <w:lvlText w:val="o"/>
+      <w:lvlJc w:val="left"/>
+      <w:pPr>
+        <w:ind w:left="3600" w:hanging="360"/>
+      </w:pPr>
+      <w:rPr>
+        <w:rFonts w:ascii="Courier New" w:hAnsi="Courier New" w:cs="Courier New" w:hint="default"/>
+      </w:rPr>
+    </w:lvl>
+    <w:lvl w:ilvl="5" w:tplc="04090005" w:tentative="1">
+      <w:start w:val="1"/>
+      <w:numFmt w:val="bullet"/>
+      <w:lvlText w:val=""/>
+      <w:lvlJc w:val="left"/>
+      <w:pPr>
+        <w:ind w:left="4320" w:hanging="360"/>
+      </w:pPr>
+      <w:rPr>
+        <w:rFonts w:ascii="Wingdings" w:hAnsi="Wingdings" w:hint="default"/>
+      </w:rPr>
+    </w:lvl>
+    <w:lvl w:ilvl="6" w:tplc="04090001" w:tentative="1">
+      <w:start w:val="1"/>
+      <w:numFmt w:val="bullet"/>
+      <w:lvlText w:val=""/>
+      <w:lvlJc w:val="left"/>
+      <w:pPr>
+        <w:ind w:left="5040" w:hanging="360"/>
+      </w:pPr>
+      <w:rPr>
+        <w:rFonts w:ascii="Symbol" w:hAnsi="Symbol" w:hint="default"/>
+      </w:rPr>
+    </w:lvl>
+    <w:lvl w:ilvl="7" w:tplc="04090003" w:tentative="1">
+      <w:start w:val="1"/>
+      <w:numFmt w:val="bullet"/>
+      <w:lvlText w:val="o"/>
+      <w:lvlJc w:val="left"/>
+      <w:pPr>
+        <w:ind w:left="5760" w:hanging="360"/>
+      </w:pPr>
+      <w:rPr>
+        <w:rFonts w:ascii="Courier New" w:hAnsi="Courier New" w:cs="Courier New" w:hint="default"/>
+      </w:rPr>
+    </w:lvl>
+    <w:lvl w:ilvl="8" w:tplc="04090005" w:tentative="1">
+      <w:start w:val="1"/>
+      <w:numFmt w:val="bullet"/>
+      <w:lvlText w:val=""/>
+      <w:lvlJc w:val="left"/>
+      <w:pPr>
+        <w:ind w:left="6480" w:hanging="360"/>
+      </w:pPr>
+      <w:rPr>
+        <w:rFonts w:ascii="Wingdings" w:hAnsi="Wingdings" w:hint="default"/>
+      </w:rPr>
+    </w:lvl>
+  </w:abstractNum>
+  <w:abstractNum w:abstractNumId="1" w15:restartNumberingAfterBreak="0">
     <w:nsid w:val="19B26781"/>
     <w:multiLevelType w:val="hybridMultilevel"/>
     <w:tmpl w:val="10FC1574"/>
@@ -2575,10 +3014,10 @@
       </w:rPr>
     </w:lvl>
   </w:abstractNum>
-  <w:abstractNum w:abstractNumId="1" w15:restartNumberingAfterBreak="0">
-    <w:nsid w:val="22497BDE"/>
+  <w:abstractNum w:abstractNumId="2" w15:restartNumberingAfterBreak="0">
+    <w:nsid w:val="1D807E53"/>
     <w:multiLevelType w:val="multilevel"/>
-    <w:tmpl w:val="904A0552"/>
+    <w:tmpl w:val="A0B49960"/>
     <w:lvl w:ilvl="0">
       <w:start w:val="1"/>
       <w:numFmt w:val="decimal"/>
@@ -2591,6 +3030,584 @@
         <w:ind w:left="720" w:hanging="360"/>
       </w:pPr>
     </w:lvl>
+    <w:lvl w:ilvl="1">
+      <w:start w:val="1"/>
+      <w:numFmt w:val="decimal"/>
+      <w:lvlText w:val="%2-"/>
+      <w:lvlJc w:val="left"/>
+      <w:pPr>
+        <w:ind w:left="810" w:hanging="360"/>
+      </w:pPr>
+      <w:rPr>
+        <w:rFonts w:hint="default"/>
+      </w:rPr>
+    </w:lvl>
+    <w:lvl w:ilvl="2" w:tentative="1">
+      <w:start w:val="1"/>
+      <w:numFmt w:val="decimal"/>
+      <w:lvlText w:val="%3."/>
+      <w:lvlJc w:val="left"/>
+      <w:pPr>
+        <w:tabs>
+          <w:tab w:val="num" w:pos="2160"/>
+        </w:tabs>
+        <w:ind w:left="2160" w:hanging="360"/>
+      </w:pPr>
+    </w:lvl>
+    <w:lvl w:ilvl="3" w:tentative="1">
+      <w:start w:val="1"/>
+      <w:numFmt w:val="decimal"/>
+      <w:lvlText w:val="%4."/>
+      <w:lvlJc w:val="left"/>
+      <w:pPr>
+        <w:tabs>
+          <w:tab w:val="num" w:pos="2880"/>
+        </w:tabs>
+        <w:ind w:left="2880" w:hanging="360"/>
+      </w:pPr>
+    </w:lvl>
+    <w:lvl w:ilvl="4" w:tentative="1">
+      <w:start w:val="1"/>
+      <w:numFmt w:val="decimal"/>
+      <w:lvlText w:val="%5."/>
+      <w:lvlJc w:val="left"/>
+      <w:pPr>
+        <w:tabs>
+          <w:tab w:val="num" w:pos="3600"/>
+        </w:tabs>
+        <w:ind w:left="3600" w:hanging="360"/>
+      </w:pPr>
+    </w:lvl>
+    <w:lvl w:ilvl="5" w:tentative="1">
+      <w:start w:val="1"/>
+      <w:numFmt w:val="decimal"/>
+      <w:lvlText w:val="%6."/>
+      <w:lvlJc w:val="left"/>
+      <w:pPr>
+        <w:tabs>
+          <w:tab w:val="num" w:pos="4320"/>
+        </w:tabs>
+        <w:ind w:left="4320" w:hanging="360"/>
+      </w:pPr>
+    </w:lvl>
+    <w:lvl w:ilvl="6" w:tentative="1">
+      <w:start w:val="1"/>
+      <w:numFmt w:val="decimal"/>
+      <w:lvlText w:val="%7."/>
+      <w:lvlJc w:val="left"/>
+      <w:pPr>
+        <w:tabs>
+          <w:tab w:val="num" w:pos="5040"/>
+        </w:tabs>
+        <w:ind w:left="5040" w:hanging="360"/>
+      </w:pPr>
+    </w:lvl>
+    <w:lvl w:ilvl="7" w:tentative="1">
+      <w:start w:val="1"/>
+      <w:numFmt w:val="decimal"/>
+      <w:lvlText w:val="%8."/>
+      <w:lvlJc w:val="left"/>
+      <w:pPr>
+        <w:tabs>
+          <w:tab w:val="num" w:pos="5760"/>
+        </w:tabs>
+        <w:ind w:left="5760" w:hanging="360"/>
+      </w:pPr>
+    </w:lvl>
+    <w:lvl w:ilvl="8" w:tentative="1">
+      <w:start w:val="1"/>
+      <w:numFmt w:val="decimal"/>
+      <w:lvlText w:val="%9."/>
+      <w:lvlJc w:val="left"/>
+      <w:pPr>
+        <w:tabs>
+          <w:tab w:val="num" w:pos="6480"/>
+        </w:tabs>
+        <w:ind w:left="6480" w:hanging="360"/>
+      </w:pPr>
+    </w:lvl>
+  </w:abstractNum>
+  <w:abstractNum w:abstractNumId="3" w15:restartNumberingAfterBreak="0">
+    <w:nsid w:val="22497BDE"/>
+    <w:multiLevelType w:val="multilevel"/>
+    <w:tmpl w:val="A0B49960"/>
+    <w:lvl w:ilvl="0">
+      <w:start w:val="1"/>
+      <w:numFmt w:val="decimal"/>
+      <w:lvlText w:val="%1."/>
+      <w:lvlJc w:val="left"/>
+      <w:pPr>
+        <w:tabs>
+          <w:tab w:val="num" w:pos="720"/>
+        </w:tabs>
+        <w:ind w:left="720" w:hanging="360"/>
+      </w:pPr>
+    </w:lvl>
+    <w:lvl w:ilvl="1">
+      <w:start w:val="1"/>
+      <w:numFmt w:val="decimal"/>
+      <w:lvlText w:val="%2-"/>
+      <w:lvlJc w:val="left"/>
+      <w:pPr>
+        <w:ind w:left="1440" w:hanging="360"/>
+      </w:pPr>
+      <w:rPr>
+        <w:rFonts w:hint="default"/>
+      </w:rPr>
+    </w:lvl>
+    <w:lvl w:ilvl="2" w:tentative="1">
+      <w:start w:val="1"/>
+      <w:numFmt w:val="decimal"/>
+      <w:lvlText w:val="%3."/>
+      <w:lvlJc w:val="left"/>
+      <w:pPr>
+        <w:tabs>
+          <w:tab w:val="num" w:pos="2160"/>
+        </w:tabs>
+        <w:ind w:left="2160" w:hanging="360"/>
+      </w:pPr>
+    </w:lvl>
+    <w:lvl w:ilvl="3" w:tentative="1">
+      <w:start w:val="1"/>
+      <w:numFmt w:val="decimal"/>
+      <w:lvlText w:val="%4."/>
+      <w:lvlJc w:val="left"/>
+      <w:pPr>
+        <w:tabs>
+          <w:tab w:val="num" w:pos="2880"/>
+        </w:tabs>
+        <w:ind w:left="2880" w:hanging="360"/>
+      </w:pPr>
+    </w:lvl>
+    <w:lvl w:ilvl="4" w:tentative="1">
+      <w:start w:val="1"/>
+      <w:numFmt w:val="decimal"/>
+      <w:lvlText w:val="%5."/>
+      <w:lvlJc w:val="left"/>
+      <w:pPr>
+        <w:tabs>
+          <w:tab w:val="num" w:pos="3600"/>
+        </w:tabs>
+        <w:ind w:left="3600" w:hanging="360"/>
+      </w:pPr>
+    </w:lvl>
+    <w:lvl w:ilvl="5" w:tentative="1">
+      <w:start w:val="1"/>
+      <w:numFmt w:val="decimal"/>
+      <w:lvlText w:val="%6."/>
+      <w:lvlJc w:val="left"/>
+      <w:pPr>
+        <w:tabs>
+          <w:tab w:val="num" w:pos="4320"/>
+        </w:tabs>
+        <w:ind w:left="4320" w:hanging="360"/>
+      </w:pPr>
+    </w:lvl>
+    <w:lvl w:ilvl="6" w:tentative="1">
+      <w:start w:val="1"/>
+      <w:numFmt w:val="decimal"/>
+      <w:lvlText w:val="%7."/>
+      <w:lvlJc w:val="left"/>
+      <w:pPr>
+        <w:tabs>
+          <w:tab w:val="num" w:pos="5040"/>
+        </w:tabs>
+        <w:ind w:left="5040" w:hanging="360"/>
+      </w:pPr>
+    </w:lvl>
+    <w:lvl w:ilvl="7" w:tentative="1">
+      <w:start w:val="1"/>
+      <w:numFmt w:val="decimal"/>
+      <w:lvlText w:val="%8."/>
+      <w:lvlJc w:val="left"/>
+      <w:pPr>
+        <w:tabs>
+          <w:tab w:val="num" w:pos="5760"/>
+        </w:tabs>
+        <w:ind w:left="5760" w:hanging="360"/>
+      </w:pPr>
+    </w:lvl>
+    <w:lvl w:ilvl="8" w:tentative="1">
+      <w:start w:val="1"/>
+      <w:numFmt w:val="decimal"/>
+      <w:lvlText w:val="%9."/>
+      <w:lvlJc w:val="left"/>
+      <w:pPr>
+        <w:tabs>
+          <w:tab w:val="num" w:pos="6480"/>
+        </w:tabs>
+        <w:ind w:left="6480" w:hanging="360"/>
+      </w:pPr>
+    </w:lvl>
+  </w:abstractNum>
+  <w:abstractNum w:abstractNumId="4" w15:restartNumberingAfterBreak="0">
+    <w:nsid w:val="263B5AAF"/>
+    <w:multiLevelType w:val="hybridMultilevel"/>
+    <w:tmpl w:val="82E62826"/>
+    <w:lvl w:ilvl="0" w:tplc="04090001">
+      <w:start w:val="1"/>
+      <w:numFmt w:val="bullet"/>
+      <w:lvlText w:val=""/>
+      <w:lvlJc w:val="left"/>
+      <w:pPr>
+        <w:ind w:left="720" w:hanging="360"/>
+      </w:pPr>
+      <w:rPr>
+        <w:rFonts w:ascii="Symbol" w:hAnsi="Symbol" w:hint="default"/>
+      </w:rPr>
+    </w:lvl>
+    <w:lvl w:ilvl="1" w:tplc="04090003" w:tentative="1">
+      <w:start w:val="1"/>
+      <w:numFmt w:val="bullet"/>
+      <w:lvlText w:val="o"/>
+      <w:lvlJc w:val="left"/>
+      <w:pPr>
+        <w:ind w:left="1440" w:hanging="360"/>
+      </w:pPr>
+      <w:rPr>
+        <w:rFonts w:ascii="Courier New" w:hAnsi="Courier New" w:cs="Courier New" w:hint="default"/>
+      </w:rPr>
+    </w:lvl>
+    <w:lvl w:ilvl="2" w:tplc="04090005" w:tentative="1">
+      <w:start w:val="1"/>
+      <w:numFmt w:val="bullet"/>
+      <w:lvlText w:val=""/>
+      <w:lvlJc w:val="left"/>
+      <w:pPr>
+        <w:ind w:left="2160" w:hanging="360"/>
+      </w:pPr>
+      <w:rPr>
+        <w:rFonts w:ascii="Wingdings" w:hAnsi="Wingdings" w:hint="default"/>
+      </w:rPr>
+    </w:lvl>
+    <w:lvl w:ilvl="3" w:tplc="04090001" w:tentative="1">
+      <w:start w:val="1"/>
+      <w:numFmt w:val="bullet"/>
+      <w:lvlText w:val=""/>
+      <w:lvlJc w:val="left"/>
+      <w:pPr>
+        <w:ind w:left="2880" w:hanging="360"/>
+      </w:pPr>
+      <w:rPr>
+        <w:rFonts w:ascii="Symbol" w:hAnsi="Symbol" w:hint="default"/>
+      </w:rPr>
+    </w:lvl>
+    <w:lvl w:ilvl="4" w:tplc="04090003" w:tentative="1">
+      <w:start w:val="1"/>
+      <w:numFmt w:val="bullet"/>
+      <w:lvlText w:val="o"/>
+      <w:lvlJc w:val="left"/>
+      <w:pPr>
+        <w:ind w:left="3600" w:hanging="360"/>
+      </w:pPr>
+      <w:rPr>
+        <w:rFonts w:ascii="Courier New" w:hAnsi="Courier New" w:cs="Courier New" w:hint="default"/>
+      </w:rPr>
+    </w:lvl>
+    <w:lvl w:ilvl="5" w:tplc="04090005" w:tentative="1">
+      <w:start w:val="1"/>
+      <w:numFmt w:val="bullet"/>
+      <w:lvlText w:val=""/>
+      <w:lvlJc w:val="left"/>
+      <w:pPr>
+        <w:ind w:left="4320" w:hanging="360"/>
+      </w:pPr>
+      <w:rPr>
+        <w:rFonts w:ascii="Wingdings" w:hAnsi="Wingdings" w:hint="default"/>
+      </w:rPr>
+    </w:lvl>
+    <w:lvl w:ilvl="6" w:tplc="04090001" w:tentative="1">
+      <w:start w:val="1"/>
+      <w:numFmt w:val="bullet"/>
+      <w:lvlText w:val=""/>
+      <w:lvlJc w:val="left"/>
+      <w:pPr>
+        <w:ind w:left="5040" w:hanging="360"/>
+      </w:pPr>
+      <w:rPr>
+        <w:rFonts w:ascii="Symbol" w:hAnsi="Symbol" w:hint="default"/>
+      </w:rPr>
+    </w:lvl>
+    <w:lvl w:ilvl="7" w:tplc="04090003" w:tentative="1">
+      <w:start w:val="1"/>
+      <w:numFmt w:val="bullet"/>
+      <w:lvlText w:val="o"/>
+      <w:lvlJc w:val="left"/>
+      <w:pPr>
+        <w:ind w:left="5760" w:hanging="360"/>
+      </w:pPr>
+      <w:rPr>
+        <w:rFonts w:ascii="Courier New" w:hAnsi="Courier New" w:cs="Courier New" w:hint="default"/>
+      </w:rPr>
+    </w:lvl>
+    <w:lvl w:ilvl="8" w:tplc="04090005" w:tentative="1">
+      <w:start w:val="1"/>
+      <w:numFmt w:val="bullet"/>
+      <w:lvlText w:val=""/>
+      <w:lvlJc w:val="left"/>
+      <w:pPr>
+        <w:ind w:left="6480" w:hanging="360"/>
+      </w:pPr>
+      <w:rPr>
+        <w:rFonts w:ascii="Wingdings" w:hAnsi="Wingdings" w:hint="default"/>
+      </w:rPr>
+    </w:lvl>
+  </w:abstractNum>
+  <w:abstractNum w:abstractNumId="5" w15:restartNumberingAfterBreak="0">
+    <w:nsid w:val="28D82A11"/>
+    <w:multiLevelType w:val="hybridMultilevel"/>
+    <w:tmpl w:val="23E0D0EC"/>
+    <w:lvl w:ilvl="0" w:tplc="04090001">
+      <w:start w:val="1"/>
+      <w:numFmt w:val="bullet"/>
+      <w:lvlText w:val=""/>
+      <w:lvlJc w:val="left"/>
+      <w:pPr>
+        <w:ind w:left="720" w:hanging="360"/>
+      </w:pPr>
+      <w:rPr>
+        <w:rFonts w:ascii="Symbol" w:hAnsi="Symbol" w:hint="default"/>
+      </w:rPr>
+    </w:lvl>
+    <w:lvl w:ilvl="1" w:tplc="04090003">
+      <w:start w:val="1"/>
+      <w:numFmt w:val="bullet"/>
+      <w:lvlText w:val="o"/>
+      <w:lvlJc w:val="left"/>
+      <w:pPr>
+        <w:ind w:left="1440" w:hanging="360"/>
+      </w:pPr>
+      <w:rPr>
+        <w:rFonts w:ascii="Courier New" w:hAnsi="Courier New" w:cs="Courier New" w:hint="default"/>
+      </w:rPr>
+    </w:lvl>
+    <w:lvl w:ilvl="2" w:tplc="04090005" w:tentative="1">
+      <w:start w:val="1"/>
+      <w:numFmt w:val="bullet"/>
+      <w:lvlText w:val=""/>
+      <w:lvlJc w:val="left"/>
+      <w:pPr>
+        <w:ind w:left="2160" w:hanging="360"/>
+      </w:pPr>
+      <w:rPr>
+        <w:rFonts w:ascii="Wingdings" w:hAnsi="Wingdings" w:hint="default"/>
+      </w:rPr>
+    </w:lvl>
+    <w:lvl w:ilvl="3" w:tplc="04090001" w:tentative="1">
+      <w:start w:val="1"/>
+      <w:numFmt w:val="bullet"/>
+      <w:lvlText w:val=""/>
+      <w:lvlJc w:val="left"/>
+      <w:pPr>
+        <w:ind w:left="2880" w:hanging="360"/>
+      </w:pPr>
+      <w:rPr>
+        <w:rFonts w:ascii="Symbol" w:hAnsi="Symbol" w:hint="default"/>
+      </w:rPr>
+    </w:lvl>
+    <w:lvl w:ilvl="4" w:tplc="04090003" w:tentative="1">
+      <w:start w:val="1"/>
+      <w:numFmt w:val="bullet"/>
+      <w:lvlText w:val="o"/>
+      <w:lvlJc w:val="left"/>
+      <w:pPr>
+        <w:ind w:left="3600" w:hanging="360"/>
+      </w:pPr>
+      <w:rPr>
+        <w:rFonts w:ascii="Courier New" w:hAnsi="Courier New" w:cs="Courier New" w:hint="default"/>
+      </w:rPr>
+    </w:lvl>
+    <w:lvl w:ilvl="5" w:tplc="04090005" w:tentative="1">
+      <w:start w:val="1"/>
+      <w:numFmt w:val="bullet"/>
+      <w:lvlText w:val=""/>
+      <w:lvlJc w:val="left"/>
+      <w:pPr>
+        <w:ind w:left="4320" w:hanging="360"/>
+      </w:pPr>
+      <w:rPr>
+        <w:rFonts w:ascii="Wingdings" w:hAnsi="Wingdings" w:hint="default"/>
+      </w:rPr>
+    </w:lvl>
+    <w:lvl w:ilvl="6" w:tplc="04090001" w:tentative="1">
+      <w:start w:val="1"/>
+      <w:numFmt w:val="bullet"/>
+      <w:lvlText w:val=""/>
+      <w:lvlJc w:val="left"/>
+      <w:pPr>
+        <w:ind w:left="5040" w:hanging="360"/>
+      </w:pPr>
+      <w:rPr>
+        <w:rFonts w:ascii="Symbol" w:hAnsi="Symbol" w:hint="default"/>
+      </w:rPr>
+    </w:lvl>
+    <w:lvl w:ilvl="7" w:tplc="04090003" w:tentative="1">
+      <w:start w:val="1"/>
+      <w:numFmt w:val="bullet"/>
+      <w:lvlText w:val="o"/>
+      <w:lvlJc w:val="left"/>
+      <w:pPr>
+        <w:ind w:left="5760" w:hanging="360"/>
+      </w:pPr>
+      <w:rPr>
+        <w:rFonts w:ascii="Courier New" w:hAnsi="Courier New" w:cs="Courier New" w:hint="default"/>
+      </w:rPr>
+    </w:lvl>
+    <w:lvl w:ilvl="8" w:tplc="04090005" w:tentative="1">
+      <w:start w:val="1"/>
+      <w:numFmt w:val="bullet"/>
+      <w:lvlText w:val=""/>
+      <w:lvlJc w:val="left"/>
+      <w:pPr>
+        <w:ind w:left="6480" w:hanging="360"/>
+      </w:pPr>
+      <w:rPr>
+        <w:rFonts w:ascii="Wingdings" w:hAnsi="Wingdings" w:hint="default"/>
+      </w:rPr>
+    </w:lvl>
+  </w:abstractNum>
+  <w:abstractNum w:abstractNumId="6" w15:restartNumberingAfterBreak="0">
+    <w:nsid w:val="2DEA32CC"/>
+    <w:multiLevelType w:val="multilevel"/>
+    <w:tmpl w:val="4A9469EA"/>
+    <w:lvl w:ilvl="0">
+      <w:start w:val="1"/>
+      <w:numFmt w:val="decimal"/>
+      <w:lvlText w:val="%1."/>
+      <w:lvlJc w:val="left"/>
+      <w:pPr>
+        <w:ind w:left="720" w:hanging="360"/>
+      </w:pPr>
+    </w:lvl>
+    <w:lvl w:ilvl="1">
+      <w:start w:val="3"/>
+      <w:numFmt w:val="decimal"/>
+      <w:isLgl/>
+      <w:lvlText w:val="%1.%2"/>
+      <w:lvlJc w:val="left"/>
+      <w:pPr>
+        <w:ind w:left="1140" w:hanging="420"/>
+      </w:pPr>
+      <w:rPr>
+        <w:rFonts w:hint="default"/>
+        <w:b w:val="0"/>
+      </w:rPr>
+    </w:lvl>
+    <w:lvl w:ilvl="2">
+      <w:start w:val="1"/>
+      <w:numFmt w:val="decimal"/>
+      <w:isLgl/>
+      <w:lvlText w:val="%1.%2.%3"/>
+      <w:lvlJc w:val="left"/>
+      <w:pPr>
+        <w:ind w:left="1800" w:hanging="720"/>
+      </w:pPr>
+      <w:rPr>
+        <w:rFonts w:hint="default"/>
+        <w:b w:val="0"/>
+      </w:rPr>
+    </w:lvl>
+    <w:lvl w:ilvl="3">
+      <w:start w:val="1"/>
+      <w:numFmt w:val="decimal"/>
+      <w:isLgl/>
+      <w:lvlText w:val="%1.%2.%3.%4"/>
+      <w:lvlJc w:val="left"/>
+      <w:pPr>
+        <w:ind w:left="2520" w:hanging="1080"/>
+      </w:pPr>
+      <w:rPr>
+        <w:rFonts w:hint="default"/>
+        <w:b w:val="0"/>
+      </w:rPr>
+    </w:lvl>
+    <w:lvl w:ilvl="4">
+      <w:start w:val="1"/>
+      <w:numFmt w:val="decimal"/>
+      <w:isLgl/>
+      <w:lvlText w:val="%1.%2.%3.%4.%5"/>
+      <w:lvlJc w:val="left"/>
+      <w:pPr>
+        <w:ind w:left="2880" w:hanging="1080"/>
+      </w:pPr>
+      <w:rPr>
+        <w:rFonts w:hint="default"/>
+        <w:b w:val="0"/>
+      </w:rPr>
+    </w:lvl>
+    <w:lvl w:ilvl="5">
+      <w:start w:val="1"/>
+      <w:numFmt w:val="decimal"/>
+      <w:isLgl/>
+      <w:lvlText w:val="%1.%2.%3.%4.%5.%6"/>
+      <w:lvlJc w:val="left"/>
+      <w:pPr>
+        <w:ind w:left="3600" w:hanging="1440"/>
+      </w:pPr>
+      <w:rPr>
+        <w:rFonts w:hint="default"/>
+        <w:b w:val="0"/>
+      </w:rPr>
+    </w:lvl>
+    <w:lvl w:ilvl="6">
+      <w:start w:val="1"/>
+      <w:numFmt w:val="decimal"/>
+      <w:isLgl/>
+      <w:lvlText w:val="%1.%2.%3.%4.%5.%6.%7"/>
+      <w:lvlJc w:val="left"/>
+      <w:pPr>
+        <w:ind w:left="3960" w:hanging="1440"/>
+      </w:pPr>
+      <w:rPr>
+        <w:rFonts w:hint="default"/>
+        <w:b w:val="0"/>
+      </w:rPr>
+    </w:lvl>
+    <w:lvl w:ilvl="7">
+      <w:start w:val="1"/>
+      <w:numFmt w:val="decimal"/>
+      <w:isLgl/>
+      <w:lvlText w:val="%1.%2.%3.%4.%5.%6.%7.%8"/>
+      <w:lvlJc w:val="left"/>
+      <w:pPr>
+        <w:ind w:left="4680" w:hanging="1800"/>
+      </w:pPr>
+      <w:rPr>
+        <w:rFonts w:hint="default"/>
+        <w:b w:val="0"/>
+      </w:rPr>
+    </w:lvl>
+    <w:lvl w:ilvl="8">
+      <w:start w:val="1"/>
+      <w:numFmt w:val="decimal"/>
+      <w:isLgl/>
+      <w:lvlText w:val="%1.%2.%3.%4.%5.%6.%7.%8.%9"/>
+      <w:lvlJc w:val="left"/>
+      <w:pPr>
+        <w:ind w:left="5400" w:hanging="2160"/>
+      </w:pPr>
+      <w:rPr>
+        <w:rFonts w:hint="default"/>
+        <w:b w:val="0"/>
+      </w:rPr>
+    </w:lvl>
+  </w:abstractNum>
+  <w:abstractNum w:abstractNumId="7" w15:restartNumberingAfterBreak="0">
+    <w:nsid w:val="2F53352A"/>
+    <w:multiLevelType w:val="multilevel"/>
+    <w:tmpl w:val="904A0552"/>
+    <w:lvl w:ilvl="0">
+      <w:start w:val="1"/>
+      <w:numFmt w:val="decimal"/>
+      <w:lvlText w:val="%1."/>
+      <w:lvlJc w:val="left"/>
+      <w:pPr>
+        <w:tabs>
+          <w:tab w:val="num" w:pos="720"/>
+        </w:tabs>
+        <w:ind w:left="720" w:hanging="360"/>
+      </w:pPr>
+    </w:lvl>
     <w:lvl w:ilvl="1" w:tentative="1">
       <w:start w:val="1"/>
       <w:numFmt w:val="decimal"/>
@@ -2688,123 +3705,10 @@
       </w:pPr>
     </w:lvl>
   </w:abstractNum>
-  <w:abstractNum w:abstractNumId="2" w15:restartNumberingAfterBreak="0">
-    <w:nsid w:val="263B5AAF"/>
-    <w:multiLevelType w:val="hybridMultilevel"/>
-    <w:tmpl w:val="82E62826"/>
-    <w:lvl w:ilvl="0" w:tplc="04090001">
-      <w:start w:val="1"/>
-      <w:numFmt w:val="bullet"/>
-      <w:lvlText w:val=""/>
-      <w:lvlJc w:val="left"/>
-      <w:pPr>
-        <w:ind w:left="720" w:hanging="360"/>
-      </w:pPr>
-      <w:rPr>
-        <w:rFonts w:ascii="Symbol" w:hAnsi="Symbol" w:hint="default"/>
-      </w:rPr>
-    </w:lvl>
-    <w:lvl w:ilvl="1" w:tplc="04090003" w:tentative="1">
-      <w:start w:val="1"/>
-      <w:numFmt w:val="bullet"/>
-      <w:lvlText w:val="o"/>
-      <w:lvlJc w:val="left"/>
-      <w:pPr>
-        <w:ind w:left="1440" w:hanging="360"/>
-      </w:pPr>
-      <w:rPr>
-        <w:rFonts w:ascii="Courier New" w:hAnsi="Courier New" w:cs="Courier New" w:hint="default"/>
-      </w:rPr>
-    </w:lvl>
-    <w:lvl w:ilvl="2" w:tplc="04090005" w:tentative="1">
-      <w:start w:val="1"/>
-      <w:numFmt w:val="bullet"/>
-      <w:lvlText w:val=""/>
-      <w:lvlJc w:val="left"/>
-      <w:pPr>
-        <w:ind w:left="2160" w:hanging="360"/>
-      </w:pPr>
-      <w:rPr>
-        <w:rFonts w:ascii="Wingdings" w:hAnsi="Wingdings" w:hint="default"/>
-      </w:rPr>
-    </w:lvl>
-    <w:lvl w:ilvl="3" w:tplc="04090001" w:tentative="1">
-      <w:start w:val="1"/>
-      <w:numFmt w:val="bullet"/>
-      <w:lvlText w:val=""/>
-      <w:lvlJc w:val="left"/>
-      <w:pPr>
-        <w:ind w:left="2880" w:hanging="360"/>
-      </w:pPr>
-      <w:rPr>
-        <w:rFonts w:ascii="Symbol" w:hAnsi="Symbol" w:hint="default"/>
-      </w:rPr>
-    </w:lvl>
-    <w:lvl w:ilvl="4" w:tplc="04090003" w:tentative="1">
-      <w:start w:val="1"/>
-      <w:numFmt w:val="bullet"/>
-      <w:lvlText w:val="o"/>
-      <w:lvlJc w:val="left"/>
-      <w:pPr>
-        <w:ind w:left="3600" w:hanging="360"/>
-      </w:pPr>
-      <w:rPr>
-        <w:rFonts w:ascii="Courier New" w:hAnsi="Courier New" w:cs="Courier New" w:hint="default"/>
-      </w:rPr>
-    </w:lvl>
-    <w:lvl w:ilvl="5" w:tplc="04090005" w:tentative="1">
-      <w:start w:val="1"/>
-      <w:numFmt w:val="bullet"/>
-      <w:lvlText w:val=""/>
-      <w:lvlJc w:val="left"/>
-      <w:pPr>
-        <w:ind w:left="4320" w:hanging="360"/>
-      </w:pPr>
-      <w:rPr>
-        <w:rFonts w:ascii="Wingdings" w:hAnsi="Wingdings" w:hint="default"/>
-      </w:rPr>
-    </w:lvl>
-    <w:lvl w:ilvl="6" w:tplc="04090001" w:tentative="1">
-      <w:start w:val="1"/>
-      <w:numFmt w:val="bullet"/>
-      <w:lvlText w:val=""/>
-      <w:lvlJc w:val="left"/>
-      <w:pPr>
-        <w:ind w:left="5040" w:hanging="360"/>
-      </w:pPr>
-      <w:rPr>
-        <w:rFonts w:ascii="Symbol" w:hAnsi="Symbol" w:hint="default"/>
-      </w:rPr>
-    </w:lvl>
-    <w:lvl w:ilvl="7" w:tplc="04090003" w:tentative="1">
-      <w:start w:val="1"/>
-      <w:numFmt w:val="bullet"/>
-      <w:lvlText w:val="o"/>
-      <w:lvlJc w:val="left"/>
-      <w:pPr>
-        <w:ind w:left="5760" w:hanging="360"/>
-      </w:pPr>
-      <w:rPr>
-        <w:rFonts w:ascii="Courier New" w:hAnsi="Courier New" w:cs="Courier New" w:hint="default"/>
-      </w:rPr>
-    </w:lvl>
-    <w:lvl w:ilvl="8" w:tplc="04090005" w:tentative="1">
-      <w:start w:val="1"/>
-      <w:numFmt w:val="bullet"/>
-      <w:lvlText w:val=""/>
-      <w:lvlJc w:val="left"/>
-      <w:pPr>
-        <w:ind w:left="6480" w:hanging="360"/>
-      </w:pPr>
-      <w:rPr>
-        <w:rFonts w:ascii="Wingdings" w:hAnsi="Wingdings" w:hint="default"/>
-      </w:rPr>
-    </w:lvl>
-  </w:abstractNum>
-  <w:abstractNum w:abstractNumId="3" w15:restartNumberingAfterBreak="0">
-    <w:nsid w:val="2F53352A"/>
+  <w:abstractNum w:abstractNumId="8" w15:restartNumberingAfterBreak="0">
+    <w:nsid w:val="31AD056A"/>
     <w:multiLevelType w:val="multilevel"/>
-    <w:tmpl w:val="904A0552"/>
+    <w:tmpl w:val="D3C02134"/>
     <w:lvl w:ilvl="0">
       <w:start w:val="1"/>
       <w:numFmt w:val="decimal"/>
@@ -2914,14 +3818,342 @@
       </w:pPr>
     </w:lvl>
   </w:abstractNum>
-  <w:abstractNum w:abstractNumId="4" w15:restartNumberingAfterBreak="0">
-    <w:nsid w:val="31AD056A"/>
+  <w:abstractNum w:abstractNumId="9" w15:restartNumberingAfterBreak="0">
+    <w:nsid w:val="356E6DCB"/>
+    <w:multiLevelType w:val="hybridMultilevel"/>
+    <w:tmpl w:val="6458F236"/>
+    <w:lvl w:ilvl="0" w:tplc="23748972">
+      <w:start w:val="1"/>
+      <w:numFmt w:val="decimal"/>
+      <w:lvlText w:val="%1."/>
+      <w:lvlJc w:val="left"/>
+      <w:pPr>
+        <w:ind w:left="588" w:hanging="360"/>
+      </w:pPr>
+      <w:rPr>
+        <w:rFonts w:ascii="Arial" w:hAnsi="Arial" w:cs="Arial" w:hint="default"/>
+      </w:rPr>
+    </w:lvl>
+    <w:lvl w:ilvl="1" w:tplc="04090019" w:tentative="1">
+      <w:start w:val="1"/>
+      <w:numFmt w:val="lowerLetter"/>
+      <w:lvlText w:val="%2."/>
+      <w:lvlJc w:val="left"/>
+      <w:pPr>
+        <w:ind w:left="1308" w:hanging="360"/>
+      </w:pPr>
+    </w:lvl>
+    <w:lvl w:ilvl="2" w:tplc="0409001B" w:tentative="1">
+      <w:start w:val="1"/>
+      <w:numFmt w:val="lowerRoman"/>
+      <w:lvlText w:val="%3."/>
+      <w:lvlJc w:val="right"/>
+      <w:pPr>
+        <w:ind w:left="2028" w:hanging="180"/>
+      </w:pPr>
+    </w:lvl>
+    <w:lvl w:ilvl="3" w:tplc="0409000F" w:tentative="1">
+      <w:start w:val="1"/>
+      <w:numFmt w:val="decimal"/>
+      <w:lvlText w:val="%4."/>
+      <w:lvlJc w:val="left"/>
+      <w:pPr>
+        <w:ind w:left="2748" w:hanging="360"/>
+      </w:pPr>
+    </w:lvl>
+    <w:lvl w:ilvl="4" w:tplc="04090019" w:tentative="1">
+      <w:start w:val="1"/>
+      <w:numFmt w:val="lowerLetter"/>
+      <w:lvlText w:val="%5."/>
+      <w:lvlJc w:val="left"/>
+      <w:pPr>
+        <w:ind w:left="3468" w:hanging="360"/>
+      </w:pPr>
+    </w:lvl>
+    <w:lvl w:ilvl="5" w:tplc="0409001B" w:tentative="1">
+      <w:start w:val="1"/>
+      <w:numFmt w:val="lowerRoman"/>
+      <w:lvlText w:val="%6."/>
+      <w:lvlJc w:val="right"/>
+      <w:pPr>
+        <w:ind w:left="4188" w:hanging="180"/>
+      </w:pPr>
+    </w:lvl>
+    <w:lvl w:ilvl="6" w:tplc="0409000F" w:tentative="1">
+      <w:start w:val="1"/>
+      <w:numFmt w:val="decimal"/>
+      <w:lvlText w:val="%7."/>
+      <w:lvlJc w:val="left"/>
+      <w:pPr>
+        <w:ind w:left="4908" w:hanging="360"/>
+      </w:pPr>
+    </w:lvl>
+    <w:lvl w:ilvl="7" w:tplc="04090019" w:tentative="1">
+      <w:start w:val="1"/>
+      <w:numFmt w:val="lowerLetter"/>
+      <w:lvlText w:val="%8."/>
+      <w:lvlJc w:val="left"/>
+      <w:pPr>
+        <w:ind w:left="5628" w:hanging="360"/>
+      </w:pPr>
+    </w:lvl>
+    <w:lvl w:ilvl="8" w:tplc="0409001B" w:tentative="1">
+      <w:start w:val="1"/>
+      <w:numFmt w:val="lowerRoman"/>
+      <w:lvlText w:val="%9."/>
+      <w:lvlJc w:val="right"/>
+      <w:pPr>
+        <w:ind w:left="6348" w:hanging="180"/>
+      </w:pPr>
+    </w:lvl>
+  </w:abstractNum>
+  <w:abstractNum w:abstractNumId="10" w15:restartNumberingAfterBreak="0">
+    <w:nsid w:val="37D81E0B"/>
+    <w:multiLevelType w:val="hybridMultilevel"/>
+    <w:tmpl w:val="A5F6424C"/>
+    <w:lvl w:ilvl="0" w:tplc="04090001">
+      <w:start w:val="1"/>
+      <w:numFmt w:val="bullet"/>
+      <w:lvlText w:val=""/>
+      <w:lvlJc w:val="left"/>
+      <w:pPr>
+        <w:ind w:left="720" w:hanging="360"/>
+      </w:pPr>
+      <w:rPr>
+        <w:rFonts w:ascii="Symbol" w:hAnsi="Symbol" w:hint="default"/>
+      </w:rPr>
+    </w:lvl>
+    <w:lvl w:ilvl="1" w:tplc="04090003" w:tentative="1">
+      <w:start w:val="1"/>
+      <w:numFmt w:val="bullet"/>
+      <w:lvlText w:val="o"/>
+      <w:lvlJc w:val="left"/>
+      <w:pPr>
+        <w:ind w:left="1440" w:hanging="360"/>
+      </w:pPr>
+      <w:rPr>
+        <w:rFonts w:ascii="Courier New" w:hAnsi="Courier New" w:cs="Courier New" w:hint="default"/>
+      </w:rPr>
+    </w:lvl>
+    <w:lvl w:ilvl="2" w:tplc="04090005" w:tentative="1">
+      <w:start w:val="1"/>
+      <w:numFmt w:val="bullet"/>
+      <w:lvlText w:val=""/>
+      <w:lvlJc w:val="left"/>
+      <w:pPr>
+        <w:ind w:left="2160" w:hanging="360"/>
+      </w:pPr>
+      <w:rPr>
+        <w:rFonts w:ascii="Wingdings" w:hAnsi="Wingdings" w:hint="default"/>
+      </w:rPr>
+    </w:lvl>
+    <w:lvl w:ilvl="3" w:tplc="04090001" w:tentative="1">
+      <w:start w:val="1"/>
+      <w:numFmt w:val="bullet"/>
+      <w:lvlText w:val=""/>
+      <w:lvlJc w:val="left"/>
+      <w:pPr>
+        <w:ind w:left="2880" w:hanging="360"/>
+      </w:pPr>
+      <w:rPr>
+        <w:rFonts w:ascii="Symbol" w:hAnsi="Symbol" w:hint="default"/>
+      </w:rPr>
+    </w:lvl>
+    <w:lvl w:ilvl="4" w:tplc="04090003" w:tentative="1">
+      <w:start w:val="1"/>
+      <w:numFmt w:val="bullet"/>
+      <w:lvlText w:val="o"/>
+      <w:lvlJc w:val="left"/>
+      <w:pPr>
+        <w:ind w:left="3600" w:hanging="360"/>
+      </w:pPr>
+      <w:rPr>
+        <w:rFonts w:ascii="Courier New" w:hAnsi="Courier New" w:cs="Courier New" w:hint="default"/>
+      </w:rPr>
+    </w:lvl>
+    <w:lvl w:ilvl="5" w:tplc="04090005" w:tentative="1">
+      <w:start w:val="1"/>
+      <w:numFmt w:val="bullet"/>
+      <w:lvlText w:val=""/>
+      <w:lvlJc w:val="left"/>
+      <w:pPr>
+        <w:ind w:left="4320" w:hanging="360"/>
+      </w:pPr>
+      <w:rPr>
+        <w:rFonts w:ascii="Wingdings" w:hAnsi="Wingdings" w:hint="default"/>
+      </w:rPr>
+    </w:lvl>
+    <w:lvl w:ilvl="6" w:tplc="04090001" w:tentative="1">
+      <w:start w:val="1"/>
+      <w:numFmt w:val="bullet"/>
+      <w:lvlText w:val=""/>
+      <w:lvlJc w:val="left"/>
+      <w:pPr>
+        <w:ind w:left="5040" w:hanging="360"/>
+      </w:pPr>
+      <w:rPr>
+        <w:rFonts w:ascii="Symbol" w:hAnsi="Symbol" w:hint="default"/>
+      </w:rPr>
+    </w:lvl>
+    <w:lvl w:ilvl="7" w:tplc="04090003" w:tentative="1">
+      <w:start w:val="1"/>
+      <w:numFmt w:val="bullet"/>
+      <w:lvlText w:val="o"/>
+      <w:lvlJc w:val="left"/>
+      <w:pPr>
+        <w:ind w:left="5760" w:hanging="360"/>
+      </w:pPr>
+      <w:rPr>
+        <w:rFonts w:ascii="Courier New" w:hAnsi="Courier New" w:cs="Courier New" w:hint="default"/>
+      </w:rPr>
+    </w:lvl>
+    <w:lvl w:ilvl="8" w:tplc="04090005" w:tentative="1">
+      <w:start w:val="1"/>
+      <w:numFmt w:val="bullet"/>
+      <w:lvlText w:val=""/>
+      <w:lvlJc w:val="left"/>
+      <w:pPr>
+        <w:ind w:left="6480" w:hanging="360"/>
+      </w:pPr>
+      <w:rPr>
+        <w:rFonts w:ascii="Wingdings" w:hAnsi="Wingdings" w:hint="default"/>
+      </w:rPr>
+    </w:lvl>
+  </w:abstractNum>
+  <w:abstractNum w:abstractNumId="11" w15:restartNumberingAfterBreak="0">
+    <w:nsid w:val="42114183"/>
     <w:multiLevelType w:val="multilevel"/>
-    <w:tmpl w:val="D3C02134"/>
+    <w:tmpl w:val="4A9469EA"/>
     <w:lvl w:ilvl="0">
       <w:start w:val="1"/>
       <w:numFmt w:val="decimal"/>
       <w:lvlText w:val="%1."/>
+      <w:lvlJc w:val="left"/>
+      <w:pPr>
+        <w:ind w:left="720" w:hanging="360"/>
+      </w:pPr>
+    </w:lvl>
+    <w:lvl w:ilvl="1">
+      <w:start w:val="3"/>
+      <w:numFmt w:val="decimal"/>
+      <w:isLgl/>
+      <w:lvlText w:val="%1.%2"/>
+      <w:lvlJc w:val="left"/>
+      <w:pPr>
+        <w:ind w:left="1140" w:hanging="420"/>
+      </w:pPr>
+      <w:rPr>
+        <w:rFonts w:hint="default"/>
+        <w:b w:val="0"/>
+      </w:rPr>
+    </w:lvl>
+    <w:lvl w:ilvl="2">
+      <w:start w:val="1"/>
+      <w:numFmt w:val="decimal"/>
+      <w:isLgl/>
+      <w:lvlText w:val="%1.%2.%3"/>
+      <w:lvlJc w:val="left"/>
+      <w:pPr>
+        <w:ind w:left="1800" w:hanging="720"/>
+      </w:pPr>
+      <w:rPr>
+        <w:rFonts w:hint="default"/>
+        <w:b w:val="0"/>
+      </w:rPr>
+    </w:lvl>
+    <w:lvl w:ilvl="3">
+      <w:start w:val="1"/>
+      <w:numFmt w:val="decimal"/>
+      <w:isLgl/>
+      <w:lvlText w:val="%1.%2.%3.%4"/>
+      <w:lvlJc w:val="left"/>
+      <w:pPr>
+        <w:ind w:left="2520" w:hanging="1080"/>
+      </w:pPr>
+      <w:rPr>
+        <w:rFonts w:hint="default"/>
+        <w:b w:val="0"/>
+      </w:rPr>
+    </w:lvl>
+    <w:lvl w:ilvl="4">
+      <w:start w:val="1"/>
+      <w:numFmt w:val="decimal"/>
+      <w:isLgl/>
+      <w:lvlText w:val="%1.%2.%3.%4.%5"/>
+      <w:lvlJc w:val="left"/>
+      <w:pPr>
+        <w:ind w:left="2880" w:hanging="1080"/>
+      </w:pPr>
+      <w:rPr>
+        <w:rFonts w:hint="default"/>
+        <w:b w:val="0"/>
+      </w:rPr>
+    </w:lvl>
+    <w:lvl w:ilvl="5">
+      <w:start w:val="1"/>
+      <w:numFmt w:val="decimal"/>
+      <w:isLgl/>
+      <w:lvlText w:val="%1.%2.%3.%4.%5.%6"/>
+      <w:lvlJc w:val="left"/>
+      <w:pPr>
+        <w:ind w:left="3600" w:hanging="1440"/>
+      </w:pPr>
+      <w:rPr>
+        <w:rFonts w:hint="default"/>
+        <w:b w:val="0"/>
+      </w:rPr>
+    </w:lvl>
+    <w:lvl w:ilvl="6">
+      <w:start w:val="1"/>
+      <w:numFmt w:val="decimal"/>
+      <w:isLgl/>
+      <w:lvlText w:val="%1.%2.%3.%4.%5.%6.%7"/>
+      <w:lvlJc w:val="left"/>
+      <w:pPr>
+        <w:ind w:left="3960" w:hanging="1440"/>
+      </w:pPr>
+      <w:rPr>
+        <w:rFonts w:hint="default"/>
+        <w:b w:val="0"/>
+      </w:rPr>
+    </w:lvl>
+    <w:lvl w:ilvl="7">
+      <w:start w:val="1"/>
+      <w:numFmt w:val="decimal"/>
+      <w:isLgl/>
+      <w:lvlText w:val="%1.%2.%3.%4.%5.%6.%7.%8"/>
+      <w:lvlJc w:val="left"/>
+      <w:pPr>
+        <w:ind w:left="4680" w:hanging="1800"/>
+      </w:pPr>
+      <w:rPr>
+        <w:rFonts w:hint="default"/>
+        <w:b w:val="0"/>
+      </w:rPr>
+    </w:lvl>
+    <w:lvl w:ilvl="8">
+      <w:start w:val="1"/>
+      <w:numFmt w:val="decimal"/>
+      <w:isLgl/>
+      <w:lvlText w:val="%1.%2.%3.%4.%5.%6.%7.%8.%9"/>
+      <w:lvlJc w:val="left"/>
+      <w:pPr>
+        <w:ind w:left="5400" w:hanging="2160"/>
+      </w:pPr>
+      <w:rPr>
+        <w:rFonts w:hint="default"/>
+        <w:b w:val="0"/>
+      </w:rPr>
+    </w:lvl>
+  </w:abstractNum>
+  <w:abstractNum w:abstractNumId="12" w15:restartNumberingAfterBreak="0">
+    <w:nsid w:val="4F507487"/>
+    <w:multiLevelType w:val="multilevel"/>
+    <w:tmpl w:val="6F94ED50"/>
+    <w:lvl w:ilvl="0">
+      <w:start w:val="1"/>
+      <w:numFmt w:val="bullet"/>
+      <w:lvlText w:val=""/>
       <w:lvlJc w:val="left"/>
       <w:pPr>
         <w:tabs>
@@ -2929,11 +4161,15 @@
         </w:tabs>
         <w:ind w:left="720" w:hanging="360"/>
       </w:pPr>
+      <w:rPr>
+        <w:rFonts w:ascii="Symbol" w:hAnsi="Symbol" w:hint="default"/>
+        <w:sz w:val="20"/>
+      </w:rPr>
     </w:lvl>
     <w:lvl w:ilvl="1" w:tentative="1">
       <w:start w:val="1"/>
-      <w:numFmt w:val="decimal"/>
-      <w:lvlText w:val="%2."/>
+      <w:numFmt w:val="bullet"/>
+      <w:lvlText w:val=""/>
       <w:lvlJc w:val="left"/>
       <w:pPr>
         <w:tabs>
@@ -2941,11 +4177,15 @@
         </w:tabs>
         <w:ind w:left="1440" w:hanging="360"/>
       </w:pPr>
+      <w:rPr>
+        <w:rFonts w:ascii="Symbol" w:hAnsi="Symbol" w:hint="default"/>
+        <w:sz w:val="20"/>
+      </w:rPr>
     </w:lvl>
     <w:lvl w:ilvl="2" w:tentative="1">
       <w:start w:val="1"/>
-      <w:numFmt w:val="decimal"/>
-      <w:lvlText w:val="%3."/>
+      <w:numFmt w:val="bullet"/>
+      <w:lvlText w:val=""/>
       <w:lvlJc w:val="left"/>
       <w:pPr>
         <w:tabs>
@@ -2953,11 +4193,15 @@
         </w:tabs>
         <w:ind w:left="2160" w:hanging="360"/>
       </w:pPr>
+      <w:rPr>
+        <w:rFonts w:ascii="Symbol" w:hAnsi="Symbol" w:hint="default"/>
+        <w:sz w:val="20"/>
+      </w:rPr>
     </w:lvl>
     <w:lvl w:ilvl="3" w:tentative="1">
       <w:start w:val="1"/>
-      <w:numFmt w:val="decimal"/>
-      <w:lvlText w:val="%4."/>
+      <w:numFmt w:val="bullet"/>
+      <w:lvlText w:val=""/>
       <w:lvlJc w:val="left"/>
       <w:pPr>
         <w:tabs>
@@ -2965,11 +4209,15 @@
         </w:tabs>
         <w:ind w:left="2880" w:hanging="360"/>
       </w:pPr>
+      <w:rPr>
+        <w:rFonts w:ascii="Symbol" w:hAnsi="Symbol" w:hint="default"/>
+        <w:sz w:val="20"/>
+      </w:rPr>
     </w:lvl>
     <w:lvl w:ilvl="4" w:tentative="1">
       <w:start w:val="1"/>
-      <w:numFmt w:val="decimal"/>
-      <w:lvlText w:val="%5."/>
+      <w:numFmt w:val="bullet"/>
+      <w:lvlText w:val=""/>
       <w:lvlJc w:val="left"/>
       <w:pPr>
         <w:tabs>
@@ -2977,11 +4225,15 @@
         </w:tabs>
         <w:ind w:left="3600" w:hanging="360"/>
       </w:pPr>
+      <w:rPr>
+        <w:rFonts w:ascii="Symbol" w:hAnsi="Symbol" w:hint="default"/>
+        <w:sz w:val="20"/>
+      </w:rPr>
     </w:lvl>
     <w:lvl w:ilvl="5" w:tentative="1">
       <w:start w:val="1"/>
-      <w:numFmt w:val="decimal"/>
-      <w:lvlText w:val="%6."/>
+      <w:numFmt w:val="bullet"/>
+      <w:lvlText w:val=""/>
       <w:lvlJc w:val="left"/>
       <w:pPr>
         <w:tabs>
@@ -2989,11 +4241,15 @@
         </w:tabs>
         <w:ind w:left="4320" w:hanging="360"/>
       </w:pPr>
+      <w:rPr>
+        <w:rFonts w:ascii="Symbol" w:hAnsi="Symbol" w:hint="default"/>
+        <w:sz w:val="20"/>
+      </w:rPr>
     </w:lvl>
     <w:lvl w:ilvl="6" w:tentative="1">
       <w:start w:val="1"/>
-      <w:numFmt w:val="decimal"/>
-      <w:lvlText w:val="%7."/>
+      <w:numFmt w:val="bullet"/>
+      <w:lvlText w:val=""/>
       <w:lvlJc w:val="left"/>
       <w:pPr>
         <w:tabs>
@@ -3001,11 +4257,15 @@
         </w:tabs>
         <w:ind w:left="5040" w:hanging="360"/>
       </w:pPr>
+      <w:rPr>
+        <w:rFonts w:ascii="Symbol" w:hAnsi="Symbol" w:hint="default"/>
+        <w:sz w:val="20"/>
+      </w:rPr>
     </w:lvl>
     <w:lvl w:ilvl="7" w:tentative="1">
       <w:start w:val="1"/>
-      <w:numFmt w:val="decimal"/>
-      <w:lvlText w:val="%8."/>
+      <w:numFmt w:val="bullet"/>
+      <w:lvlText w:val=""/>
       <w:lvlJc w:val="left"/>
       <w:pPr>
         <w:tabs>
@@ -3013,11 +4273,15 @@
         </w:tabs>
         <w:ind w:left="5760" w:hanging="360"/>
       </w:pPr>
+      <w:rPr>
+        <w:rFonts w:ascii="Symbol" w:hAnsi="Symbol" w:hint="default"/>
+        <w:sz w:val="20"/>
+      </w:rPr>
     </w:lvl>
     <w:lvl w:ilvl="8" w:tentative="1">
       <w:start w:val="1"/>
-      <w:numFmt w:val="decimal"/>
-      <w:lvlText w:val="%9."/>
+      <w:numFmt w:val="bullet"/>
+      <w:lvlText w:val=""/>
       <w:lvlJc w:val="left"/>
       <w:pPr>
         <w:tabs>
@@ -3025,129 +4289,150 @@
         </w:tabs>
         <w:ind w:left="6480" w:hanging="360"/>
       </w:pPr>
+      <w:rPr>
+        <w:rFonts w:ascii="Symbol" w:hAnsi="Symbol" w:hint="default"/>
+        <w:sz w:val="20"/>
+      </w:rPr>
     </w:lvl>
   </w:abstractNum>
-  <w:abstractNum w:abstractNumId="5" w15:restartNumberingAfterBreak="0">
-    <w:nsid w:val="37D81E0B"/>
-    <w:multiLevelType w:val="hybridMultilevel"/>
-    <w:tmpl w:val="A5F6424C"/>
-    <w:lvl w:ilvl="0" w:tplc="04090001">
-      <w:start w:val="1"/>
-      <w:numFmt w:val="bullet"/>
-      <w:lvlText w:val=""/>
+  <w:abstractNum w:abstractNumId="13" w15:restartNumberingAfterBreak="0">
+    <w:nsid w:val="637F5513"/>
+    <w:multiLevelType w:val="multilevel"/>
+    <w:tmpl w:val="D4D6A916"/>
+    <w:lvl w:ilvl="0">
+      <w:start w:val="1"/>
+      <w:numFmt w:val="decimal"/>
+      <w:lvlText w:val="%1."/>
       <w:lvlJc w:val="left"/>
       <w:pPr>
         <w:ind w:left="720" w:hanging="360"/>
       </w:pPr>
       <w:rPr>
-        <w:rFonts w:ascii="Symbol" w:hAnsi="Symbol" w:hint="default"/>
-      </w:rPr>
-    </w:lvl>
-    <w:lvl w:ilvl="1" w:tplc="04090003" w:tentative="1">
-      <w:start w:val="1"/>
-      <w:numFmt w:val="bullet"/>
-      <w:lvlText w:val="o"/>
-      <w:lvlJc w:val="left"/>
-      <w:pPr>
-        <w:ind w:left="1440" w:hanging="360"/>
-      </w:pPr>
-      <w:rPr>
-        <w:rFonts w:ascii="Courier New" w:hAnsi="Courier New" w:cs="Courier New" w:hint="default"/>
-      </w:rPr>
-    </w:lvl>
-    <w:lvl w:ilvl="2" w:tplc="04090005" w:tentative="1">
-      <w:start w:val="1"/>
-      <w:numFmt w:val="bullet"/>
-      <w:lvlText w:val=""/>
-      <w:lvlJc w:val="left"/>
-      <w:pPr>
-        <w:ind w:left="2160" w:hanging="360"/>
-      </w:pPr>
-      <w:rPr>
-        <w:rFonts w:ascii="Wingdings" w:hAnsi="Wingdings" w:hint="default"/>
-      </w:rPr>
-    </w:lvl>
-    <w:lvl w:ilvl="3" w:tplc="04090001" w:tentative="1">
-      <w:start w:val="1"/>
-      <w:numFmt w:val="bullet"/>
-      <w:lvlText w:val=""/>
-      <w:lvlJc w:val="left"/>
-      <w:pPr>
-        <w:ind w:left="2880" w:hanging="360"/>
-      </w:pPr>
-      <w:rPr>
-        <w:rFonts w:ascii="Symbol" w:hAnsi="Symbol" w:hint="default"/>
-      </w:rPr>
-    </w:lvl>
-    <w:lvl w:ilvl="4" w:tplc="04090003" w:tentative="1">
-      <w:start w:val="1"/>
-      <w:numFmt w:val="bullet"/>
-      <w:lvlText w:val="o"/>
-      <w:lvlJc w:val="left"/>
-      <w:pPr>
-        <w:ind w:left="3600" w:hanging="360"/>
-      </w:pPr>
-      <w:rPr>
-        <w:rFonts w:ascii="Courier New" w:hAnsi="Courier New" w:cs="Courier New" w:hint="default"/>
-      </w:rPr>
-    </w:lvl>
-    <w:lvl w:ilvl="5" w:tplc="04090005" w:tentative="1">
-      <w:start w:val="1"/>
-      <w:numFmt w:val="bullet"/>
-      <w:lvlText w:val=""/>
-      <w:lvlJc w:val="left"/>
-      <w:pPr>
-        <w:ind w:left="4320" w:hanging="360"/>
-      </w:pPr>
-      <w:rPr>
-        <w:rFonts w:ascii="Wingdings" w:hAnsi="Wingdings" w:hint="default"/>
-      </w:rPr>
-    </w:lvl>
-    <w:lvl w:ilvl="6" w:tplc="04090001" w:tentative="1">
-      <w:start w:val="1"/>
-      <w:numFmt w:val="bullet"/>
-      <w:lvlText w:val=""/>
-      <w:lvlJc w:val="left"/>
-      <w:pPr>
-        <w:ind w:left="5040" w:hanging="360"/>
-      </w:pPr>
-      <w:rPr>
-        <w:rFonts w:ascii="Symbol" w:hAnsi="Symbol" w:hint="default"/>
-      </w:rPr>
-    </w:lvl>
-    <w:lvl w:ilvl="7" w:tplc="04090003" w:tentative="1">
-      <w:start w:val="1"/>
-      <w:numFmt w:val="bullet"/>
-      <w:lvlText w:val="o"/>
-      <w:lvlJc w:val="left"/>
-      <w:pPr>
-        <w:ind w:left="5760" w:hanging="360"/>
-      </w:pPr>
-      <w:rPr>
-        <w:rFonts w:ascii="Courier New" w:hAnsi="Courier New" w:cs="Courier New" w:hint="default"/>
-      </w:rPr>
-    </w:lvl>
-    <w:lvl w:ilvl="8" w:tplc="04090005" w:tentative="1">
-      <w:start w:val="1"/>
-      <w:numFmt w:val="bullet"/>
-      <w:lvlText w:val=""/>
-      <w:lvlJc w:val="left"/>
-      <w:pPr>
-        <w:ind w:left="6480" w:hanging="360"/>
-      </w:pPr>
-      <w:rPr>
-        <w:rFonts w:ascii="Wingdings" w:hAnsi="Wingdings" w:hint="default"/>
+        <w:b/>
+        <w:bCs/>
+      </w:rPr>
+    </w:lvl>
+    <w:lvl w:ilvl="1">
+      <w:start w:val="3"/>
+      <w:numFmt w:val="decimal"/>
+      <w:isLgl/>
+      <w:lvlText w:val="%1.%2"/>
+      <w:lvlJc w:val="left"/>
+      <w:pPr>
+        <w:ind w:left="1140" w:hanging="420"/>
+      </w:pPr>
+      <w:rPr>
+        <w:rFonts w:hint="default"/>
+        <w:b w:val="0"/>
+      </w:rPr>
+    </w:lvl>
+    <w:lvl w:ilvl="2">
+      <w:start w:val="1"/>
+      <w:numFmt w:val="decimal"/>
+      <w:isLgl/>
+      <w:lvlText w:val="%1.%2.%3"/>
+      <w:lvlJc w:val="left"/>
+      <w:pPr>
+        <w:ind w:left="1800" w:hanging="720"/>
+      </w:pPr>
+      <w:rPr>
+        <w:rFonts w:hint="default"/>
+        <w:b w:val="0"/>
+      </w:rPr>
+    </w:lvl>
+    <w:lvl w:ilvl="3">
+      <w:start w:val="1"/>
+      <w:numFmt w:val="decimal"/>
+      <w:isLgl/>
+      <w:lvlText w:val="%1.%2.%3.%4"/>
+      <w:lvlJc w:val="left"/>
+      <w:pPr>
+        <w:ind w:left="2520" w:hanging="1080"/>
+      </w:pPr>
+      <w:rPr>
+        <w:rFonts w:hint="default"/>
+        <w:b w:val="0"/>
+      </w:rPr>
+    </w:lvl>
+    <w:lvl w:ilvl="4">
+      <w:start w:val="1"/>
+      <w:numFmt w:val="decimal"/>
+      <w:isLgl/>
+      <w:lvlText w:val="%1.%2.%3.%4.%5"/>
+      <w:lvlJc w:val="left"/>
+      <w:pPr>
+        <w:ind w:left="2880" w:hanging="1080"/>
+      </w:pPr>
+      <w:rPr>
+        <w:rFonts w:hint="default"/>
+        <w:b w:val="0"/>
+      </w:rPr>
+    </w:lvl>
+    <w:lvl w:ilvl="5">
+      <w:start w:val="1"/>
+      <w:numFmt w:val="decimal"/>
+      <w:isLgl/>
+      <w:lvlText w:val="%1.%2.%3.%4.%5.%6"/>
+      <w:lvlJc w:val="left"/>
+      <w:pPr>
+        <w:ind w:left="3600" w:hanging="1440"/>
+      </w:pPr>
+      <w:rPr>
+        <w:rFonts w:hint="default"/>
+        <w:b w:val="0"/>
+      </w:rPr>
+    </w:lvl>
+    <w:lvl w:ilvl="6">
+      <w:start w:val="1"/>
+      <w:numFmt w:val="decimal"/>
+      <w:isLgl/>
+      <w:lvlText w:val="%1.%2.%3.%4.%5.%6.%7"/>
+      <w:lvlJc w:val="left"/>
+      <w:pPr>
+        <w:ind w:left="3960" w:hanging="1440"/>
+      </w:pPr>
+      <w:rPr>
+        <w:rFonts w:hint="default"/>
+        <w:b w:val="0"/>
+      </w:rPr>
+    </w:lvl>
+    <w:lvl w:ilvl="7">
+      <w:start w:val="1"/>
+      <w:numFmt w:val="decimal"/>
+      <w:isLgl/>
+      <w:lvlText w:val="%1.%2.%3.%4.%5.%6.%7.%8"/>
+      <w:lvlJc w:val="left"/>
+      <w:pPr>
+        <w:ind w:left="4680" w:hanging="1800"/>
+      </w:pPr>
+      <w:rPr>
+        <w:rFonts w:hint="default"/>
+        <w:b w:val="0"/>
+      </w:rPr>
+    </w:lvl>
+    <w:lvl w:ilvl="8">
+      <w:start w:val="1"/>
+      <w:numFmt w:val="decimal"/>
+      <w:isLgl/>
+      <w:lvlText w:val="%1.%2.%3.%4.%5.%6.%7.%8.%9"/>
+      <w:lvlJc w:val="left"/>
+      <w:pPr>
+        <w:ind w:left="5400" w:hanging="2160"/>
+      </w:pPr>
+      <w:rPr>
+        <w:rFonts w:hint="default"/>
+        <w:b w:val="0"/>
       </w:rPr>
     </w:lvl>
   </w:abstractNum>
-  <w:abstractNum w:abstractNumId="6" w15:restartNumberingAfterBreak="0">
-    <w:nsid w:val="4F507487"/>
+  <w:abstractNum w:abstractNumId="14" w15:restartNumberingAfterBreak="0">
+    <w:nsid w:val="63BE2DDF"/>
     <w:multiLevelType w:val="multilevel"/>
-    <w:tmpl w:val="6F94ED50"/>
+    <w:tmpl w:val="904A0552"/>
     <w:lvl w:ilvl="0">
       <w:start w:val="1"/>
-      <w:numFmt w:val="bullet"/>
-      <w:lvlText w:val=""/>
+      <w:numFmt w:val="decimal"/>
+      <w:lvlText w:val="%1."/>
       <w:lvlJc w:val="left"/>
       <w:pPr>
         <w:tabs>
@@ -3155,15 +4440,11 @@
         </w:tabs>
         <w:ind w:left="720" w:hanging="360"/>
       </w:pPr>
-      <w:rPr>
-        <w:rFonts w:ascii="Symbol" w:hAnsi="Symbol" w:hint="default"/>
-        <w:sz w:val="20"/>
-      </w:rPr>
     </w:lvl>
     <w:lvl w:ilvl="1" w:tentative="1">
       <w:start w:val="1"/>
-      <w:numFmt w:val="bullet"/>
-      <w:lvlText w:val=""/>
+      <w:numFmt w:val="decimal"/>
+      <w:lvlText w:val="%2."/>
       <w:lvlJc w:val="left"/>
       <w:pPr>
         <w:tabs>
@@ -3171,15 +4452,11 @@
         </w:tabs>
         <w:ind w:left="1440" w:hanging="360"/>
       </w:pPr>
-      <w:rPr>
-        <w:rFonts w:ascii="Symbol" w:hAnsi="Symbol" w:hint="default"/>
-        <w:sz w:val="20"/>
-      </w:rPr>
     </w:lvl>
     <w:lvl w:ilvl="2" w:tentative="1">
       <w:start w:val="1"/>
-      <w:numFmt w:val="bullet"/>
-      <w:lvlText w:val=""/>
+      <w:numFmt w:val="decimal"/>
+      <w:lvlText w:val="%3."/>
       <w:lvlJc w:val="left"/>
       <w:pPr>
         <w:tabs>
@@ -3187,15 +4464,11 @@
         </w:tabs>
         <w:ind w:left="2160" w:hanging="360"/>
       </w:pPr>
-      <w:rPr>
-        <w:rFonts w:ascii="Symbol" w:hAnsi="Symbol" w:hint="default"/>
-        <w:sz w:val="20"/>
-      </w:rPr>
     </w:lvl>
     <w:lvl w:ilvl="3" w:tentative="1">
       <w:start w:val="1"/>
-      <w:numFmt w:val="bullet"/>
-      <w:lvlText w:val=""/>
+      <w:numFmt w:val="decimal"/>
+      <w:lvlText w:val="%4."/>
       <w:lvlJc w:val="left"/>
       <w:pPr>
         <w:tabs>
@@ -3203,15 +4476,11 @@
         </w:tabs>
         <w:ind w:left="2880" w:hanging="360"/>
       </w:pPr>
-      <w:rPr>
-        <w:rFonts w:ascii="Symbol" w:hAnsi="Symbol" w:hint="default"/>
-        <w:sz w:val="20"/>
-      </w:rPr>
     </w:lvl>
     <w:lvl w:ilvl="4" w:tentative="1">
       <w:start w:val="1"/>
-      <w:numFmt w:val="bullet"/>
-      <w:lvlText w:val=""/>
+      <w:numFmt w:val="decimal"/>
+      <w:lvlText w:val="%5."/>
       <w:lvlJc w:val="left"/>
       <w:pPr>
         <w:tabs>
@@ -3219,15 +4488,11 @@
         </w:tabs>
         <w:ind w:left="3600" w:hanging="360"/>
       </w:pPr>
-      <w:rPr>
-        <w:rFonts w:ascii="Symbol" w:hAnsi="Symbol" w:hint="default"/>
-        <w:sz w:val="20"/>
-      </w:rPr>
     </w:lvl>
     <w:lvl w:ilvl="5" w:tentative="1">
       <w:start w:val="1"/>
-      <w:numFmt w:val="bullet"/>
-      <w:lvlText w:val=""/>
+      <w:numFmt w:val="decimal"/>
+      <w:lvlText w:val="%6."/>
       <w:lvlJc w:val="left"/>
       <w:pPr>
         <w:tabs>
@@ -3235,15 +4500,11 @@
         </w:tabs>
         <w:ind w:left="4320" w:hanging="360"/>
       </w:pPr>
-      <w:rPr>
-        <w:rFonts w:ascii="Symbol" w:hAnsi="Symbol" w:hint="default"/>
-        <w:sz w:val="20"/>
-      </w:rPr>
     </w:lvl>
     <w:lvl w:ilvl="6" w:tentative="1">
       <w:start w:val="1"/>
-      <w:numFmt w:val="bullet"/>
-      <w:lvlText w:val=""/>
+      <w:numFmt w:val="decimal"/>
+      <w:lvlText w:val="%7."/>
       <w:lvlJc w:val="left"/>
       <w:pPr>
         <w:tabs>
@@ -3251,15 +4512,11 @@
         </w:tabs>
         <w:ind w:left="5040" w:hanging="360"/>
       </w:pPr>
-      <w:rPr>
-        <w:rFonts w:ascii="Symbol" w:hAnsi="Symbol" w:hint="default"/>
-        <w:sz w:val="20"/>
-      </w:rPr>
     </w:lvl>
     <w:lvl w:ilvl="7" w:tentative="1">
       <w:start w:val="1"/>
-      <w:numFmt w:val="bullet"/>
-      <w:lvlText w:val=""/>
+      <w:numFmt w:val="decimal"/>
+      <w:lvlText w:val="%8."/>
       <w:lvlJc w:val="left"/>
       <w:pPr>
         <w:tabs>
@@ -3267,15 +4524,11 @@
         </w:tabs>
         <w:ind w:left="5760" w:hanging="360"/>
       </w:pPr>
-      <w:rPr>
-        <w:rFonts w:ascii="Symbol" w:hAnsi="Symbol" w:hint="default"/>
-        <w:sz w:val="20"/>
-      </w:rPr>
     </w:lvl>
     <w:lvl w:ilvl="8" w:tentative="1">
       <w:start w:val="1"/>
-      <w:numFmt w:val="bullet"/>
-      <w:lvlText w:val=""/>
+      <w:numFmt w:val="decimal"/>
+      <w:lvlText w:val="%9."/>
       <w:lvlJc w:val="left"/>
       <w:pPr>
         <w:tabs>
@@ -3283,13 +4536,9 @@
         </w:tabs>
         <w:ind w:left="6480" w:hanging="360"/>
       </w:pPr>
-      <w:rPr>
-        <w:rFonts w:ascii="Symbol" w:hAnsi="Symbol" w:hint="default"/>
-        <w:sz w:val="20"/>
-      </w:rPr>
     </w:lvl>
   </w:abstractNum>
-  <w:abstractNum w:abstractNumId="7" w15:restartNumberingAfterBreak="0">
+  <w:abstractNum w:abstractNumId="15" w15:restartNumberingAfterBreak="0">
     <w:nsid w:val="6A255228"/>
     <w:multiLevelType w:val="hybridMultilevel"/>
     <w:tmpl w:val="B88A33E6"/>
@@ -3402,7 +4651,7 @@
       </w:rPr>
     </w:lvl>
   </w:abstractNum>
-  <w:abstractNum w:abstractNumId="8" w15:restartNumberingAfterBreak="0">
+  <w:abstractNum w:abstractNumId="16" w15:restartNumberingAfterBreak="0">
     <w:nsid w:val="770D08A4"/>
     <w:multiLevelType w:val="hybridMultilevel"/>
     <w:tmpl w:val="A7700140"/>
@@ -3515,7 +4764,137 @@
       </w:rPr>
     </w:lvl>
   </w:abstractNum>
-  <w:abstractNum w:abstractNumId="9" w15:restartNumberingAfterBreak="0">
+  <w:abstractNum w:abstractNumId="17" w15:restartNumberingAfterBreak="0">
+    <w:nsid w:val="79A2161E"/>
+    <w:multiLevelType w:val="multilevel"/>
+    <w:tmpl w:val="D4D6A916"/>
+    <w:lvl w:ilvl="0">
+      <w:start w:val="1"/>
+      <w:numFmt w:val="decimal"/>
+      <w:lvlText w:val="%1."/>
+      <w:lvlJc w:val="left"/>
+      <w:pPr>
+        <w:ind w:left="720" w:hanging="360"/>
+      </w:pPr>
+      <w:rPr>
+        <w:b/>
+        <w:bCs/>
+      </w:rPr>
+    </w:lvl>
+    <w:lvl w:ilvl="1">
+      <w:start w:val="3"/>
+      <w:numFmt w:val="decimal"/>
+      <w:isLgl/>
+      <w:lvlText w:val="%1.%2"/>
+      <w:lvlJc w:val="left"/>
+      <w:pPr>
+        <w:ind w:left="1140" w:hanging="420"/>
+      </w:pPr>
+      <w:rPr>
+        <w:rFonts w:hint="default"/>
+        <w:b w:val="0"/>
+      </w:rPr>
+    </w:lvl>
+    <w:lvl w:ilvl="2">
+      <w:start w:val="1"/>
+      <w:numFmt w:val="decimal"/>
+      <w:isLgl/>
+      <w:lvlText w:val="%1.%2.%3"/>
+      <w:lvlJc w:val="left"/>
+      <w:pPr>
+        <w:ind w:left="1800" w:hanging="720"/>
+      </w:pPr>
+      <w:rPr>
+        <w:rFonts w:hint="default"/>
+        <w:b w:val="0"/>
+      </w:rPr>
+    </w:lvl>
+    <w:lvl w:ilvl="3">
+      <w:start w:val="1"/>
+      <w:numFmt w:val="decimal"/>
+      <w:isLgl/>
+      <w:lvlText w:val="%1.%2.%3.%4"/>
+      <w:lvlJc w:val="left"/>
+      <w:pPr>
+        <w:ind w:left="2520" w:hanging="1080"/>
+      </w:pPr>
+      <w:rPr>
+        <w:rFonts w:hint="default"/>
+        <w:b w:val="0"/>
+      </w:rPr>
+    </w:lvl>
+    <w:lvl w:ilvl="4">
+      <w:start w:val="1"/>
+      <w:numFmt w:val="decimal"/>
+      <w:isLgl/>
+      <w:lvlText w:val="%1.%2.%3.%4.%5"/>
+      <w:lvlJc w:val="left"/>
+      <w:pPr>
+        <w:ind w:left="2880" w:hanging="1080"/>
+      </w:pPr>
+      <w:rPr>
+        <w:rFonts w:hint="default"/>
+        <w:b w:val="0"/>
+      </w:rPr>
+    </w:lvl>
+    <w:lvl w:ilvl="5">
+      <w:start w:val="1"/>
+      <w:numFmt w:val="decimal"/>
+      <w:isLgl/>
+      <w:lvlText w:val="%1.%2.%3.%4.%5.%6"/>
+      <w:lvlJc w:val="left"/>
+      <w:pPr>
+        <w:ind w:left="3600" w:hanging="1440"/>
+      </w:pPr>
+      <w:rPr>
+        <w:rFonts w:hint="default"/>
+        <w:b w:val="0"/>
+      </w:rPr>
+    </w:lvl>
+    <w:lvl w:ilvl="6">
+      <w:start w:val="1"/>
+      <w:numFmt w:val="decimal"/>
+      <w:isLgl/>
+      <w:lvlText w:val="%1.%2.%3.%4.%5.%6.%7"/>
+      <w:lvlJc w:val="left"/>
+      <w:pPr>
+        <w:ind w:left="3960" w:hanging="1440"/>
+      </w:pPr>
+      <w:rPr>
+        <w:rFonts w:hint="default"/>
+        <w:b w:val="0"/>
+      </w:rPr>
+    </w:lvl>
+    <w:lvl w:ilvl="7">
+      <w:start w:val="1"/>
+      <w:numFmt w:val="decimal"/>
+      <w:isLgl/>
+      <w:lvlText w:val="%1.%2.%3.%4.%5.%6.%7.%8"/>
+      <w:lvlJc w:val="left"/>
+      <w:pPr>
+        <w:ind w:left="4680" w:hanging="1800"/>
+      </w:pPr>
+      <w:rPr>
+        <w:rFonts w:hint="default"/>
+        <w:b w:val="0"/>
+      </w:rPr>
+    </w:lvl>
+    <w:lvl w:ilvl="8">
+      <w:start w:val="1"/>
+      <w:numFmt w:val="decimal"/>
+      <w:isLgl/>
+      <w:lvlText w:val="%1.%2.%3.%4.%5.%6.%7.%8.%9"/>
+      <w:lvlJc w:val="left"/>
+      <w:pPr>
+        <w:ind w:left="5400" w:hanging="2160"/>
+      </w:pPr>
+      <w:rPr>
+        <w:rFonts w:hint="default"/>
+        <w:b w:val="0"/>
+      </w:rPr>
+    </w:lvl>
+  </w:abstractNum>
+  <w:abstractNum w:abstractNumId="18" w15:restartNumberingAfterBreak="0">
     <w:nsid w:val="79C70D5A"/>
     <w:multiLevelType w:val="hybridMultilevel"/>
     <w:tmpl w:val="F45876AA"/>
@@ -3629,34 +5008,34 @@
     </w:lvl>
   </w:abstractNum>
   <w:num w:numId="1" w16cid:durableId="1294211949">
-    <w:abstractNumId w:val="6"/>
+    <w:abstractNumId w:val="12"/>
   </w:num>
   <w:num w:numId="2" w16cid:durableId="1637374280">
-    <w:abstractNumId w:val="9"/>
+    <w:abstractNumId w:val="18"/>
   </w:num>
   <w:num w:numId="3" w16cid:durableId="2004385214">
-    <w:abstractNumId w:val="5"/>
+    <w:abstractNumId w:val="10"/>
   </w:num>
   <w:num w:numId="4" w16cid:durableId="2110345657">
+    <w:abstractNumId w:val="15"/>
+  </w:num>
+  <w:num w:numId="5" w16cid:durableId="1953239448">
+    <w:abstractNumId w:val="4"/>
+  </w:num>
+  <w:num w:numId="6" w16cid:durableId="183785568">
+    <w:abstractNumId w:val="1"/>
+  </w:num>
+  <w:num w:numId="7" w16cid:durableId="1004698834">
+    <w:abstractNumId w:val="16"/>
+  </w:num>
+  <w:num w:numId="8" w16cid:durableId="871069764">
     <w:abstractNumId w:val="7"/>
   </w:num>
-  <w:num w:numId="5" w16cid:durableId="1953239448">
-    <w:abstractNumId w:val="2"/>
-  </w:num>
-  <w:num w:numId="6" w16cid:durableId="183785568">
-    <w:abstractNumId w:val="0"/>
-  </w:num>
-  <w:num w:numId="7" w16cid:durableId="1004698834">
+  <w:num w:numId="9" w16cid:durableId="70202933">
     <w:abstractNumId w:val="8"/>
   </w:num>
-  <w:num w:numId="8" w16cid:durableId="871069764">
-    <w:abstractNumId w:val="3"/>
-  </w:num>
-  <w:num w:numId="9" w16cid:durableId="70202933">
-    <w:abstractNumId w:val="4"/>
-  </w:num>
   <w:num w:numId="10" w16cid:durableId="627316422">
-    <w:abstractNumId w:val="3"/>
+    <w:abstractNumId w:val="7"/>
     <w:lvlOverride w:ilvl="0">
       <w:startOverride w:val="1"/>
     </w:lvlOverride>
@@ -3686,7 +5065,34 @@
     </w:lvlOverride>
   </w:num>
   <w:num w:numId="11" w16cid:durableId="1194879632">
-    <w:abstractNumId w:val="1"/>
+    <w:abstractNumId w:val="3"/>
+  </w:num>
+  <w:num w:numId="12" w16cid:durableId="2052724863">
+    <w:abstractNumId w:val="14"/>
+  </w:num>
+  <w:num w:numId="13" w16cid:durableId="1960378634">
+    <w:abstractNumId w:val="9"/>
+  </w:num>
+  <w:num w:numId="14" w16cid:durableId="2005624696">
+    <w:abstractNumId w:val="11"/>
+  </w:num>
+  <w:num w:numId="15" w16cid:durableId="657654077">
+    <w:abstractNumId w:val="6"/>
+  </w:num>
+  <w:num w:numId="16" w16cid:durableId="1836146880">
+    <w:abstractNumId w:val="17"/>
+  </w:num>
+  <w:num w:numId="17" w16cid:durableId="971128831">
+    <w:abstractNumId w:val="13"/>
+  </w:num>
+  <w:num w:numId="18" w16cid:durableId="297297477">
+    <w:abstractNumId w:val="5"/>
+  </w:num>
+  <w:num w:numId="19" w16cid:durableId="1636131956">
+    <w:abstractNumId w:val="0"/>
+  </w:num>
+  <w:num w:numId="20" w16cid:durableId="780342523">
+    <w:abstractNumId w:val="2"/>
   </w:num>
 </w:numbering>
 </file>

</xml_diff>